<commit_message>
Add full-workflow screenshots to docs
Generate real-GUI screenshots (PySide6 widgets + mock data, real Windows
platform for CJK fonts) covering the full workflow, via tools/make_screenshots.py:
- mechanical_settings_dialog (read settings: PSD random-vibration setup)
- mechanical_results_dialog (read results: M1/M2 Solution result tabs)
- zemax_pose_results (lens rigid-body decenter/tilt table after import)
- zemax_random_vibration (random-vibration import tab, N(0,Σ) sampling)
- zemax_detector_window (detector list, trace summary w/ centroid, DTS
  controls, real false-color spot from actual detector data)
Regenerate solving shot with running operation-panel state; replace the old
detector mock with the detector window. Embed all into 软件说明 / 使用说明书,
regenerate both .docx with images and re-apply justify + first-line indent.

Co-Authored-By: Claude Opus 4.8 <noreply@anthropic.com>
</commit_message>
<xml_diff>
--- a/docs/软件说明.docx
+++ b/docs/软件说明.docx
@@ -2,7 +2,7 @@
 <file path=word/document.xml><?xml version="1.0" encoding="utf-8"?>
 <w:document xmlns:w="http://schemas.openxmlformats.org/wordprocessingml/2006/main" xmlns:m="http://schemas.openxmlformats.org/officeDocument/2006/math" xmlns:r="http://schemas.openxmlformats.org/officeDocument/2006/relationships" xmlns:o="urn:schemas-microsoft-com:office:office" xmlns:v="urn:schemas-microsoft-com:vml" xmlns:w10="urn:schemas-microsoft-com:office:word" xmlns:a="http://schemas.openxmlformats.org/drawingml/2006/main" xmlns:pic="http://schemas.openxmlformats.org/drawingml/2006/picture" xmlns:wp="http://schemas.openxmlformats.org/drawingml/2006/wordprocessingDrawing">
   <w:body>
-    <w:bookmarkStart w:id="36" w:name="ansys-mechanical-zemax联合仿真程序-软件说明"/>
+    <w:bookmarkStart w:id="48" w:name="ansys-mechanical-zemax联合仿真程序-软件说明"/>
     <w:p>
       <w:pPr>
         <w:pStyle w:val="Heading1"/>
@@ -1661,7 +1661,7 @@
       <w:r>
         <w:drawing>
           <wp:inline>
-            <wp:extent cx="5334000" cy="3557367"/>
+            <wp:extent cx="5334000" cy="3200399"/>
             <wp:effectExtent b="0" l="0" r="0" t="0"/>
             <wp:docPr descr="Mechanical 主界面" title="" id="15" name="Picture"/>
             <a:graphic>
@@ -1675,6 +1675,1467 @@
                   </pic:nvPicPr>
                   <pic:blipFill>
                     <a:blip r:embed="rId14"/>
+                    <a:stretch>
+                      <a:fillRect/>
+                    </a:stretch>
+                  </pic:blipFill>
+                  <pic:spPr bwMode="auto">
+                    <a:xfrm>
+                      <a:off x="0" y="0"/>
+                      <a:ext cx="5334000" cy="3200399"/>
+                    </a:xfrm>
+                    <a:prstGeom prst="rect">
+                      <a:avLst/>
+                    </a:prstGeom>
+                    <a:noFill/>
+                    <a:ln w="9525">
+                      <a:noFill/>
+                      <a:headEnd/>
+                      <a:tailEnd/>
+                    </a:ln>
+                  </pic:spPr>
+                </pic:pic>
+              </a:graphicData>
+            </a:graphic>
+          </wp:inline>
+        </w:drawing>
+      </w:r>
+    </w:p>
+    <w:p>
+      <w:pPr>
+        <w:pStyle w:val="ImageCaption"/>
+      </w:pPr>
+      <w:r>
+        <w:t xml:space="preserve">Mechanical </w:t>
+      </w:r>
+      <w:r>
+        <w:rPr>
+          <w:rFonts w:hint="eastAsia"/>
+        </w:rPr>
+        <w:t xml:space="preserve">主界面</w:t>
+      </w:r>
+    </w:p>
+    <w:p>
+      <w:pPr>
+        <w:pStyle w:val="BodyText"/>
+      </w:pPr>
+      <w:r>
+        <w:t xml:space="preserve">Mechanical </w:t>
+      </w:r>
+      <w:r>
+        <w:rPr>
+          <w:rFonts w:hint="eastAsia"/>
+        </w:rPr>
+        <w:t xml:space="preserve">页面顶部是</w:t>
+      </w:r>
+      <w:r>
+        <w:t xml:space="preserve"> Mechanical </w:t>
+      </w:r>
+      <w:r>
+        <w:rPr>
+          <w:rFonts w:hint="eastAsia"/>
+        </w:rPr>
+        <w:t xml:space="preserve">控制台与环境状态。控制台用于选择</w:t>
+      </w:r>
+      <w:r>
+        <w:t xml:space="preserve"> </w:t>
+      </w:r>
+      <w:r>
+        <w:rPr>
+          <w:rStyle w:val="VerbatimChar"/>
+        </w:rPr>
+        <w:t xml:space="preserve">.mechdb</w:t>
+      </w:r>
+      <w:r>
+        <w:t xml:space="preserve"> </w:t>
+      </w:r>
+      <w:r>
+        <w:t xml:space="preserve">/</w:t>
+      </w:r>
+      <w:r>
+        <w:t xml:space="preserve"> </w:t>
+      </w:r>
+      <w:r>
+        <w:rPr>
+          <w:rStyle w:val="VerbatimChar"/>
+        </w:rPr>
+        <w:t xml:space="preserve">.mechdat</w:t>
+      </w:r>
+      <w:r>
+        <w:rPr>
+          <w:rFonts w:hint="eastAsia"/>
+        </w:rPr>
+        <w:t xml:space="preserve">、读取模块、检查环境、打开路径设置以及关闭后台</w:t>
+      </w:r>
+      <w:r>
+        <w:t xml:space="preserve"> </w:t>
+      </w:r>
+      <w:r>
+        <w:rPr>
+          <w:rFonts w:hint="eastAsia"/>
+        </w:rPr>
+        <w:t xml:space="preserve">Mechanical。环境状态单行三列显示当前工程、Zemax</w:t>
+      </w:r>
+      <w:r>
+        <w:t xml:space="preserve"> </w:t>
+      </w:r>
+      <w:r>
+        <w:rPr>
+          <w:rFonts w:hint="eastAsia"/>
+        </w:rPr>
+        <w:t xml:space="preserve">工程、RunWB2、Mechanical、OpticStudio、PyMechanical、pythonnet、PySide6</w:t>
+      </w:r>
+      <w:r>
+        <w:t xml:space="preserve"> </w:t>
+      </w:r>
+      <w:r>
+        <w:rPr>
+          <w:rFonts w:hint="eastAsia"/>
+        </w:rPr>
+        <w:t xml:space="preserve">是否可用，路径过长中间省略、悬停看全。页面中部是当前工程分析模块表（序号、系统名、模块、系统类型、物理场、分析类型、求解器），底部按钮围绕当前选中模块工作。</w:t>
+      </w:r>
+    </w:p>
+    <w:p>
+      <w:r>
+        <w:pict>
+          <v:rect style="width:0;height:1.5pt" o:hralign="center" o:hrstd="t" o:hr="t"/>
+        </w:pict>
+      </w:r>
+    </w:p>
+    <w:bookmarkEnd w:id="17"/>
+    <w:bookmarkStart w:id="18" w:name="mechanical-工作流程"/>
+    <w:p>
+      <w:pPr>
+        <w:pStyle w:val="Heading2"/>
+      </w:pPr>
+      <w:r>
+        <w:t xml:space="preserve">4. Mechanical </w:t>
+      </w:r>
+      <w:r>
+        <w:rPr>
+          <w:rFonts w:hint="eastAsia"/>
+        </w:rPr>
+        <w:t xml:space="preserve">工作流程</w:t>
+      </w:r>
+    </w:p>
+    <w:p>
+      <w:pPr>
+        <w:pStyle w:val="FirstParagraph"/>
+      </w:pPr>
+      <w:r>
+        <w:rPr>
+          <w:rFonts w:hint="eastAsia"/>
+        </w:rPr>
+        <w:t xml:space="preserve">推荐流程：选择</w:t>
+      </w:r>
+      <w:r>
+        <w:t xml:space="preserve"> database → </w:t>
+      </w:r>
+      <w:r>
+        <w:rPr>
+          <w:rFonts w:hint="eastAsia"/>
+        </w:rPr>
+        <w:t xml:space="preserve">读取模块（同时启动并保持后台会话）→</w:t>
+      </w:r>
+      <w:r>
+        <w:t xml:space="preserve"> </w:t>
+      </w:r>
+      <w:r>
+        <w:rPr>
+          <w:rFonts w:hint="eastAsia"/>
+        </w:rPr>
+        <w:t xml:space="preserve">选中目标模块</w:t>
+      </w:r>
+      <w:r>
+        <w:t xml:space="preserve"> → </w:t>
+      </w:r>
+      <w:r>
+        <w:rPr>
+          <w:rFonts w:hint="eastAsia"/>
+        </w:rPr>
+        <w:t xml:space="preserve">读取设置/求解/读取结果/导出。</w:t>
+      </w:r>
+    </w:p>
+    <w:p>
+      <w:pPr>
+        <w:pStyle w:val="BodyText"/>
+      </w:pPr>
+      <w:r>
+        <w:rPr>
+          <w:rFonts w:hint="eastAsia"/>
+        </w:rPr>
+        <w:t xml:space="preserve">选择工程时应选</w:t>
+      </w:r>
+      <w:r>
+        <w:t xml:space="preserve"> </w:t>
+      </w:r>
+      <w:r>
+        <w:rPr>
+          <w:rStyle w:val="VerbatimChar"/>
+        </w:rPr>
+        <w:t xml:space="preserve">.mechdb</w:t>
+      </w:r>
+      <w:r>
+        <w:t xml:space="preserve"> </w:t>
+      </w:r>
+      <w:r>
+        <w:rPr>
+          <w:rFonts w:hint="eastAsia"/>
+        </w:rPr>
+        <w:t xml:space="preserve">或</w:t>
+      </w:r>
+      <w:r>
+        <w:t xml:space="preserve"> </w:t>
+      </w:r>
+      <w:r>
+        <w:rPr>
+          <w:rStyle w:val="VerbatimChar"/>
+        </w:rPr>
+        <w:t xml:space="preserve">.mechdat</w:t>
+      </w:r>
+      <w:r>
+        <w:rPr>
+          <w:rFonts w:hint="eastAsia"/>
+        </w:rPr>
+        <w:t xml:space="preserve">。通过「选择文件」挑选</w:t>
+      </w:r>
+      <w:r>
+        <w:t xml:space="preserve"> database </w:t>
+      </w:r>
+      <w:r>
+        <w:rPr>
+          <w:rFonts w:hint="eastAsia"/>
+        </w:rPr>
+        <w:t xml:space="preserve">时，软件会自动后台启动并保持</w:t>
+      </w:r>
+      <w:r>
+        <w:t xml:space="preserve"> Mechanical </w:t>
+      </w:r>
+      <w:r>
+        <w:rPr>
+          <w:rFonts w:hint="eastAsia"/>
+        </w:rPr>
+        <w:t xml:space="preserve">会话；如果路径已填在输入框中，直接点击「读取模块」也会先启动并保持持久会话、再由该会话读取模块（而不是用一次性临时会话读完即退，否则随后读取/求解/导出会因无会话被拦下）。启动在后台线程执行，界面仍可响应。</w:t>
+      </w:r>
+    </w:p>
+    <w:p>
+      <w:pPr>
+        <w:pStyle w:val="BodyText"/>
+      </w:pPr>
+      <w:r>
+        <w:rPr>
+          <w:rFonts w:hint="eastAsia"/>
+        </w:rPr>
+        <w:t xml:space="preserve">「读取模块」是从会话里真实读取分析对象，不是从文件名猜测。多模块工程（静力、瞬态、随机振动等）必须先在表里选中目标模块再操作，避免把一个模块的设置或结果误用到另一个模块。</w:t>
+      </w:r>
+    </w:p>
+    <w:p>
+      <w:pPr>
+        <w:pStyle w:val="BodyText"/>
+      </w:pPr>
+      <w:r>
+        <w:rPr>
+          <w:rFonts w:hint="eastAsia"/>
+        </w:rPr>
+        <w:t xml:space="preserve">关闭</w:t>
+      </w:r>
+      <w:r>
+        <w:t xml:space="preserve"> Mechanical </w:t>
+      </w:r>
+      <w:r>
+        <w:rPr>
+          <w:rFonts w:hint="eastAsia"/>
+        </w:rPr>
+        <w:t xml:space="preserve">时提供「保存后关闭」「不保存关闭」「取消」三种选择，避免强杀进程造成</w:t>
+      </w:r>
+      <w:r>
+        <w:t xml:space="preserve"> database </w:t>
+      </w:r>
+      <w:r>
+        <w:rPr>
+          <w:rFonts w:hint="eastAsia"/>
+        </w:rPr>
+        <w:t xml:space="preserve">锁或工程损坏。软件不会绕过</w:t>
+      </w:r>
+      <w:r>
+        <w:t xml:space="preserve"> Mechanical </w:t>
+      </w:r>
+      <w:r>
+        <w:rPr>
+          <w:rFonts w:hint="eastAsia"/>
+        </w:rPr>
+        <w:t xml:space="preserve">自身的保存过程。</w:t>
+      </w:r>
+    </w:p>
+    <w:p>
+      <w:r>
+        <w:pict>
+          <v:rect style="width:0;height:1.5pt" o:hralign="center" o:hrstd="t" o:hr="t"/>
+        </w:pict>
+      </w:r>
+    </w:p>
+    <w:bookmarkEnd w:id="18"/>
+    <w:bookmarkStart w:id="28" w:name="设置求解与结果"/>
+    <w:p>
+      <w:pPr>
+        <w:pStyle w:val="Heading2"/>
+      </w:pPr>
+      <w:r>
+        <w:t xml:space="preserve">5. </w:t>
+      </w:r>
+      <w:r>
+        <w:rPr>
+          <w:rFonts w:hint="eastAsia"/>
+        </w:rPr>
+        <w:t xml:space="preserve">设置、求解与结果</w:t>
+      </w:r>
+    </w:p>
+    <w:p>
+      <w:pPr>
+        <w:pStyle w:val="FirstParagraph"/>
+      </w:pPr>
+      <w:r>
+        <w:rPr>
+          <w:rFonts w:hint="eastAsia"/>
+        </w:rPr>
+        <w:t xml:space="preserve">点击「读取设置」打开设置窗口，数据来自当前</w:t>
+      </w:r>
+      <w:r>
+        <w:t xml:space="preserve"> Mechanical </w:t>
+      </w:r>
+      <w:r>
+        <w:rPr>
+          <w:rFonts w:hint="eastAsia"/>
+        </w:rPr>
+        <w:t xml:space="preserve">会话的真实属性（</w:t>
+      </w:r>
+      <w:r>
+        <w:rPr>
+          <w:rStyle w:val="VerbatimChar"/>
+        </w:rPr>
+        <w:t xml:space="preserve">AnalysisSettings.VisibleProperties</w:t>
+      </w:r>
+      <w:r>
+        <w:rPr>
+          <w:rFonts w:hint="eastAsia"/>
+        </w:rPr>
+        <w:t xml:space="preserve">），按属性类型（数字/布尔/枚举/文本）生成控件，而非写死模板；同时读取该模块下已加入的分析条件（力、温度、重力、约束、热边界等）。常见于瞬态、随机振动的</w:t>
+      </w:r>
+      <w:r>
+        <w:t xml:space="preserve"> Tabular Data </w:t>
+      </w:r>
+      <w:r>
+        <w:rPr>
+          <w:rFonts w:hint="eastAsia"/>
+        </w:rPr>
+        <w:t xml:space="preserve">支持读取、从</w:t>
+      </w:r>
+      <w:r>
+        <w:t xml:space="preserve"> Excel/CSV/TXT </w:t>
+      </w:r>
+      <w:r>
+        <w:rPr>
+          <w:rFonts w:hint="eastAsia"/>
+        </w:rPr>
+        <w:t xml:space="preserve">导入、打开当前</w:t>
+      </w:r>
+      <w:r>
+        <w:t xml:space="preserve"> </w:t>
+      </w:r>
+      <w:r>
+        <w:rPr>
+          <w:rFonts w:hint="eastAsia"/>
+        </w:rPr>
+        <w:t xml:space="preserve">Excel——推荐导出成外部表格在</w:t>
+      </w:r>
+      <w:r>
+        <w:t xml:space="preserve"> Excel </w:t>
+      </w:r>
+      <w:r>
+        <w:rPr>
+          <w:rFonts w:hint="eastAsia"/>
+        </w:rPr>
+        <w:t xml:space="preserve">里改好再导入。</w:t>
+      </w:r>
+    </w:p>
+    <w:p>
+      <w:pPr>
+        <w:pStyle w:val="BodyText"/>
+      </w:pPr>
+      <w:r>
+        <w:rPr>
+          <w:rFonts w:hint="eastAsia"/>
+        </w:rPr>
+        <w:t xml:space="preserve">「保存设置」只写回当前后台会话，不立即写盘</w:t>
+      </w:r>
+      <w:r>
+        <w:t xml:space="preserve"> database </w:t>
+      </w:r>
+      <w:r>
+        <w:rPr>
+          <w:rFonts w:hint="eastAsia"/>
+        </w:rPr>
+        <w:t xml:space="preserve">文件；是否落盘由关闭</w:t>
+      </w:r>
+      <w:r>
+        <w:t xml:space="preserve"> Mechanical </w:t>
+      </w:r>
+      <w:r>
+        <w:rPr>
+          <w:rFonts w:hint="eastAsia"/>
+        </w:rPr>
+        <w:t xml:space="preserve">时选择，避免每改一格就触发长时间保存。</w:t>
+      </w:r>
+    </w:p>
+    <w:p>
+      <w:pPr>
+        <w:pStyle w:val="CaptionedFigure"/>
+      </w:pPr>
+      <w:r>
+        <w:drawing>
+          <wp:inline>
+            <wp:extent cx="5334000" cy="4520338"/>
+            <wp:effectExtent b="0" l="0" r="0" t="0"/>
+            <wp:docPr descr="读取设置：分析设置 / 分析条件 / Tabular Data（以随机振动 PSD 谱为例）" title="" id="20" name="Picture"/>
+            <a:graphic>
+              <a:graphicData uri="http://schemas.openxmlformats.org/drawingml/2006/picture">
+                <pic:pic>
+                  <pic:nvPicPr>
+                    <pic:cNvPr descr="images/mechanical_settings_dialog.png" id="21" name="Picture"/>
+                    <pic:cNvPicPr>
+                      <a:picLocks noChangeArrowheads="1" noChangeAspect="1"/>
+                    </pic:cNvPicPr>
+                  </pic:nvPicPr>
+                  <pic:blipFill>
+                    <a:blip r:embed="rId19"/>
+                    <a:stretch>
+                      <a:fillRect/>
+                    </a:stretch>
+                  </pic:blipFill>
+                  <pic:spPr bwMode="auto">
+                    <a:xfrm>
+                      <a:off x="0" y="0"/>
+                      <a:ext cx="5334000" cy="4520338"/>
+                    </a:xfrm>
+                    <a:prstGeom prst="rect">
+                      <a:avLst/>
+                    </a:prstGeom>
+                    <a:noFill/>
+                    <a:ln w="9525">
+                      <a:noFill/>
+                      <a:headEnd/>
+                      <a:tailEnd/>
+                    </a:ln>
+                  </pic:spPr>
+                </pic:pic>
+              </a:graphicData>
+            </a:graphic>
+          </wp:inline>
+        </w:drawing>
+      </w:r>
+    </w:p>
+    <w:p>
+      <w:pPr>
+        <w:pStyle w:val="ImageCaption"/>
+      </w:pPr>
+      <w:r>
+        <w:rPr>
+          <w:rFonts w:hint="eastAsia"/>
+        </w:rPr>
+        <w:t xml:space="preserve">读取设置：分析设置</w:t>
+      </w:r>
+      <w:r>
+        <w:t xml:space="preserve"> / </w:t>
+      </w:r>
+      <w:r>
+        <w:rPr>
+          <w:rFonts w:hint="eastAsia"/>
+        </w:rPr>
+        <w:t xml:space="preserve">分析条件</w:t>
+      </w:r>
+      <w:r>
+        <w:t xml:space="preserve"> / Tabular </w:t>
+      </w:r>
+      <w:r>
+        <w:rPr>
+          <w:rFonts w:hint="eastAsia"/>
+        </w:rPr>
+        <w:t xml:space="preserve">Data（以随机振动</w:t>
+      </w:r>
+      <w:r>
+        <w:t xml:space="preserve"> PSD </w:t>
+      </w:r>
+      <w:r>
+        <w:rPr>
+          <w:rFonts w:hint="eastAsia"/>
+        </w:rPr>
+        <w:t xml:space="preserve">谱为例）</w:t>
+      </w:r>
+    </w:p>
+    <w:p>
+      <w:pPr>
+        <w:pStyle w:val="BodyText"/>
+      </w:pPr>
+      <w:r>
+        <w:rPr>
+          <w:rFonts w:hint="eastAsia"/>
+        </w:rPr>
+        <w:t xml:space="preserve">点击「求解模块」会通过当前会话求解，</w:t>
+      </w:r>
+      <w:r>
+        <w:rPr>
+          <w:rFonts w:hint="eastAsia"/>
+          <w:b/>
+          <w:bCs/>
+        </w:rPr>
+        <w:t xml:space="preserve">求解前自动清除该模块已有结果</w:t>
+      </w:r>
+      <w:r>
+        <w:rPr>
+          <w:rFonts w:hint="eastAsia"/>
+        </w:rPr>
+        <w:t xml:space="preserve">（保证结果对应当前设置；旧结果需保留的请先备份）。求解在后台线程执行，「当前操作」面板显示阶段/状态/用时。求解失败时日志显示</w:t>
+      </w:r>
+      <w:r>
+        <w:t xml:space="preserve"> Mechanical </w:t>
+      </w:r>
+      <w:r>
+        <w:rPr>
+          <w:rFonts w:hint="eastAsia"/>
+        </w:rPr>
+        <w:t xml:space="preserve">返回的错误（约束不足、接触/材料/网格/载荷问题、结果表达式错误、许可证不足等），软件不会自动修改物理模型来掩盖错误。</w:t>
+      </w:r>
+    </w:p>
+    <w:p>
+      <w:pPr>
+        <w:pStyle w:val="CaptionedFigure"/>
+      </w:pPr>
+      <w:r>
+        <w:drawing>
+          <wp:inline>
+            <wp:extent cx="5334000" cy="3200399"/>
+            <wp:effectExtent b="0" l="0" r="0" t="0"/>
+            <wp:docPr descr="Mechanical 求解中" title="" id="23" name="Picture"/>
+            <a:graphic>
+              <a:graphicData uri="http://schemas.openxmlformats.org/drawingml/2006/picture">
+                <pic:pic>
+                  <pic:nvPicPr>
+                    <pic:cNvPr descr="images/mechanical_solve_mock.png" id="24" name="Picture"/>
+                    <pic:cNvPicPr>
+                      <a:picLocks noChangeArrowheads="1" noChangeAspect="1"/>
+                    </pic:cNvPicPr>
+                  </pic:nvPicPr>
+                  <pic:blipFill>
+                    <a:blip r:embed="rId22"/>
+                    <a:stretch>
+                      <a:fillRect/>
+                    </a:stretch>
+                  </pic:blipFill>
+                  <pic:spPr bwMode="auto">
+                    <a:xfrm>
+                      <a:off x="0" y="0"/>
+                      <a:ext cx="5334000" cy="3200399"/>
+                    </a:xfrm>
+                    <a:prstGeom prst="rect">
+                      <a:avLst/>
+                    </a:prstGeom>
+                    <a:noFill/>
+                    <a:ln w="9525">
+                      <a:noFill/>
+                      <a:headEnd/>
+                      <a:tailEnd/>
+                    </a:ln>
+                  </pic:spPr>
+                </pic:pic>
+              </a:graphicData>
+            </a:graphic>
+          </wp:inline>
+        </w:drawing>
+      </w:r>
+    </w:p>
+    <w:p>
+      <w:pPr>
+        <w:pStyle w:val="ImageCaption"/>
+      </w:pPr>
+      <w:r>
+        <w:t xml:space="preserve">Mechanical </w:t>
+      </w:r>
+      <w:r>
+        <w:rPr>
+          <w:rFonts w:hint="eastAsia"/>
+        </w:rPr>
+        <w:t xml:space="preserve">求解中</w:t>
+      </w:r>
+    </w:p>
+    <w:p>
+      <w:pPr>
+        <w:pStyle w:val="BodyText"/>
+      </w:pPr>
+      <w:r>
+        <w:rPr>
+          <w:rFonts w:hint="eastAsia"/>
+        </w:rPr>
+        <w:t xml:space="preserve">点击「读取结果」以当前模块为范围列出求解设置、分析条件与</w:t>
+      </w:r>
+      <w:r>
+        <w:t xml:space="preserve"> Solution </w:t>
+      </w:r>
+      <w:r>
+        <w:rPr>
+          <w:rFonts w:hint="eastAsia"/>
+        </w:rPr>
+        <w:t xml:space="preserve">结果对象。可把单个结果导出为</w:t>
+      </w:r>
+      <w:r>
+        <w:t xml:space="preserve"> </w:t>
+      </w:r>
+      <w:r>
+        <w:rPr>
+          <w:rFonts w:hint="eastAsia"/>
+        </w:rPr>
+        <w:t xml:space="preserve">TXT（位移/形变/力/应力等，供后续位移/旋转换算）或</w:t>
+      </w:r>
+      <w:r>
+        <w:t xml:space="preserve"> </w:t>
+      </w:r>
+      <w:r>
+        <w:rPr>
+          <w:rFonts w:hint="eastAsia"/>
+        </w:rPr>
+        <w:t xml:space="preserve">PNG（结果云图），时间/频率相关结果支持按开始/结束/间隔导出序列。</w:t>
+      </w:r>
+      <w:r>
+        <w:rPr>
+          <w:rFonts w:hint="eastAsia"/>
+          <w:b/>
+          <w:bCs/>
+        </w:rPr>
+        <w:t xml:space="preserve">用于联动的</w:t>
+      </w:r>
+      <w:r>
+        <w:rPr>
+          <w:b/>
+          <w:bCs/>
+        </w:rPr>
+        <w:t xml:space="preserve"> TXT </w:t>
+      </w:r>
+      <w:r>
+        <w:rPr>
+          <w:rFonts w:hint="eastAsia"/>
+          <w:b/>
+          <w:bCs/>
+        </w:rPr>
+        <w:t xml:space="preserve">必须包含节点原始坐标</w:t>
+      </w:r>
+      <w:r>
+        <w:rPr>
+          <w:b/>
+          <w:bCs/>
+        </w:rPr>
+        <w:t xml:space="preserve"> X/Y/Z </w:t>
+      </w:r>
+      <w:r>
+        <w:rPr>
+          <w:rFonts w:hint="eastAsia"/>
+          <w:b/>
+          <w:bCs/>
+        </w:rPr>
+        <w:t xml:space="preserve">与三方向位移</w:t>
+      </w:r>
+      <w:r>
+        <w:rPr>
+          <w:b/>
+          <w:bCs/>
+        </w:rPr>
+        <w:t xml:space="preserve"> UX/UY/UZ</w:t>
+      </w:r>
+      <w:r>
+        <w:rPr>
+          <w:rFonts w:hint="eastAsia"/>
+        </w:rPr>
+        <w:t xml:space="preserve">，否则只能算平移、无法拟合旋转。</w:t>
+      </w:r>
+    </w:p>
+    <w:p>
+      <w:pPr>
+        <w:pStyle w:val="CaptionedFigure"/>
+      </w:pPr>
+      <w:r>
+        <w:drawing>
+          <wp:inline>
+            <wp:extent cx="5334000" cy="3429000"/>
+            <wp:effectExtent b="0" l="0" r="0" t="0"/>
+            <wp:docPr descr="读取结果：列出 Solution 结果对象，选中一个导出为 TXT（含节点坐标与三方向位移）" title="" id="26" name="Picture"/>
+            <a:graphic>
+              <a:graphicData uri="http://schemas.openxmlformats.org/drawingml/2006/picture">
+                <pic:pic>
+                  <pic:nvPicPr>
+                    <pic:cNvPr descr="images/mechanical_results_dialog.png" id="27" name="Picture"/>
+                    <pic:cNvPicPr>
+                      <a:picLocks noChangeArrowheads="1" noChangeAspect="1"/>
+                    </pic:cNvPicPr>
+                  </pic:nvPicPr>
+                  <pic:blipFill>
+                    <a:blip r:embed="rId25"/>
+                    <a:stretch>
+                      <a:fillRect/>
+                    </a:stretch>
+                  </pic:blipFill>
+                  <pic:spPr bwMode="auto">
+                    <a:xfrm>
+                      <a:off x="0" y="0"/>
+                      <a:ext cx="5334000" cy="3429000"/>
+                    </a:xfrm>
+                    <a:prstGeom prst="rect">
+                      <a:avLst/>
+                    </a:prstGeom>
+                    <a:noFill/>
+                    <a:ln w="9525">
+                      <a:noFill/>
+                      <a:headEnd/>
+                      <a:tailEnd/>
+                    </a:ln>
+                  </pic:spPr>
+                </pic:pic>
+              </a:graphicData>
+            </a:graphic>
+          </wp:inline>
+        </w:drawing>
+      </w:r>
+    </w:p>
+    <w:p>
+      <w:pPr>
+        <w:pStyle w:val="ImageCaption"/>
+      </w:pPr>
+      <w:r>
+        <w:rPr>
+          <w:rFonts w:hint="eastAsia"/>
+        </w:rPr>
+        <w:t xml:space="preserve">读取结果：列出</w:t>
+      </w:r>
+      <w:r>
+        <w:t xml:space="preserve"> Solution </w:t>
+      </w:r>
+      <w:r>
+        <w:rPr>
+          <w:rFonts w:hint="eastAsia"/>
+        </w:rPr>
+        <w:t xml:space="preserve">结果对象，选中一个导出为</w:t>
+      </w:r>
+      <w:r>
+        <w:t xml:space="preserve"> </w:t>
+      </w:r>
+      <w:r>
+        <w:rPr>
+          <w:rFonts w:hint="eastAsia"/>
+        </w:rPr>
+        <w:t xml:space="preserve">TXT（含节点坐标与三方向位移）</w:t>
+      </w:r>
+    </w:p>
+    <w:p>
+      <w:r>
+        <w:pict>
+          <v:rect style="width:0;height:1.5pt" o:hralign="center" o:hrstd="t" o:hr="t"/>
+        </w:pict>
+      </w:r>
+    </w:p>
+    <w:bookmarkEnd w:id="28"/>
+    <w:bookmarkStart w:id="29" w:name="节点位移到镜片刚体位移旋转"/>
+    <w:p>
+      <w:pPr>
+        <w:pStyle w:val="Heading2"/>
+      </w:pPr>
+      <w:r>
+        <w:t xml:space="preserve">6. </w:t>
+      </w:r>
+      <w:r>
+        <w:rPr>
+          <w:rFonts w:hint="eastAsia"/>
+        </w:rPr>
+        <w:t xml:space="preserve">节点位移到镜片刚体位移/旋转</w:t>
+      </w:r>
+    </w:p>
+    <w:p>
+      <w:pPr>
+        <w:pStyle w:val="FirstParagraph"/>
+      </w:pPr>
+      <w:r>
+        <w:t xml:space="preserve">Mechanical </w:t>
+      </w:r>
+      <w:r>
+        <w:rPr>
+          <w:rFonts w:hint="eastAsia"/>
+        </w:rPr>
+        <w:t xml:space="preserve">给出节点级位移</w:t>
+      </w:r>
+      <w:r>
+        <w:t xml:space="preserve"> </w:t>
+      </w:r>
+      <w:r>
+        <w:rPr>
+          <w:rStyle w:val="VerbatimChar"/>
+        </w:rPr>
+        <w:t xml:space="preserve">uᵢ</w:t>
+      </w:r>
+      <w:r>
+        <w:rPr>
+          <w:rFonts w:hint="eastAsia"/>
+        </w:rPr>
+        <w:t xml:space="preserve">，Zemax</w:t>
+      </w:r>
+      <w:r>
+        <w:t xml:space="preserve"> </w:t>
+      </w:r>
+      <w:r>
+        <w:rPr>
+          <w:rFonts w:hint="eastAsia"/>
+        </w:rPr>
+        <w:t xml:space="preserve">非序列对象需要的是元件的整体刚体位移/旋转——横向偏心（decenter）、沿光轴离焦（despace）与倾斜（tilt）。软件把某镜片对应的一组节点当作刚体点云，求一个刚体变换</w:t>
+      </w:r>
+      <w:r>
+        <w:t xml:space="preserve"> </w:t>
+      </w:r>
+      <w:r>
+        <w:rPr>
+          <w:rStyle w:val="VerbatimChar"/>
+        </w:rPr>
+        <w:t xml:space="preserve">qᵢ ≈ R·pᵢ + t</w:t>
+      </w:r>
+      <w:r>
+        <w:rPr>
+          <w:rFonts w:hint="eastAsia"/>
+        </w:rPr>
+        <w:t xml:space="preserve">（</w:t>
+      </w:r>
+      <w:r>
+        <w:rPr>
+          <w:rStyle w:val="VerbatimChar"/>
+        </w:rPr>
+        <w:t xml:space="preserve">pᵢ</w:t>
+      </w:r>
+      <w:r>
+        <w:t xml:space="preserve"> </w:t>
+      </w:r>
+      <w:r>
+        <w:rPr>
+          <w:rFonts w:hint="eastAsia"/>
+        </w:rPr>
+        <w:t xml:space="preserve">原始坐标、</w:t>
+      </w:r>
+      <w:r>
+        <w:rPr>
+          <w:rStyle w:val="VerbatimChar"/>
+        </w:rPr>
+        <w:t xml:space="preserve">qᵢ = pᵢ + uᵢ</w:t>
+      </w:r>
+      <w:r>
+        <w:t xml:space="preserve"> </w:t>
+      </w:r>
+      <w:r>
+        <w:rPr>
+          <w:rFonts w:hint="eastAsia"/>
+        </w:rPr>
+        <w:t xml:space="preserve">变形后坐标）使其逼近所有节点的实际变形。这在数学上是带正交约束的最小二乘（正交</w:t>
+      </w:r>
+      <w:r>
+        <w:t xml:space="preserve"> Procrustes / </w:t>
+      </w:r>
+      <w:r>
+        <w:rPr>
+          <w:rFonts w:hint="eastAsia"/>
+        </w:rPr>
+        <w:t xml:space="preserve">Kabsch）问题：</w:t>
+      </w:r>
+    </w:p>
+    <w:p>
+      <w:pPr>
+        <w:pStyle w:val="Compact"/>
+        <w:numPr>
+          <w:ilvl w:val="0"/>
+          <w:numId w:val="1001"/>
+        </w:numPr>
+      </w:pPr>
+      <w:r>
+        <w:rPr>
+          <w:rFonts w:hint="eastAsia"/>
+          <w:b/>
+          <w:bCs/>
+        </w:rPr>
+        <w:t xml:space="preserve">整体平移</w:t>
+      </w:r>
+      <w:r>
+        <w:rPr>
+          <w:b/>
+          <w:bCs/>
+        </w:rPr>
+        <w:t xml:space="preserve"> t</w:t>
+      </w:r>
+      <w:r>
+        <w:rPr>
+          <w:rFonts w:hint="eastAsia"/>
+        </w:rPr>
+        <w:t xml:space="preserve">：固定</w:t>
+      </w:r>
+      <w:r>
+        <w:t xml:space="preserve"> R </w:t>
+      </w:r>
+      <w:r>
+        <w:rPr>
+          <w:rFonts w:hint="eastAsia"/>
+        </w:rPr>
+        <w:t xml:space="preserve">对</w:t>
+      </w:r>
+      <w:r>
+        <w:t xml:space="preserve"> t </w:t>
+      </w:r>
+      <w:r>
+        <w:rPr>
+          <w:rFonts w:hint="eastAsia"/>
+        </w:rPr>
+        <w:t xml:space="preserve">求极值得</w:t>
+      </w:r>
+      <w:r>
+        <w:t xml:space="preserve"> </w:t>
+      </w:r>
+      <w:r>
+        <w:rPr>
+          <w:rStyle w:val="VerbatimChar"/>
+        </w:rPr>
+        <w:t xml:space="preserve">t = q̄ − R·p̄</w:t>
+      </w:r>
+      <w:r>
+        <w:rPr>
+          <w:rFonts w:hint="eastAsia"/>
+        </w:rPr>
+        <w:t xml:space="preserve">（变形前后质心之差），物理上即把原始质心旋转后对齐到变形后质心。横向分量即偏心、沿光轴分量即离焦。代回后目标函数只剩纯旋转项，这就是「先质心平移、再绕质心拟合旋转」的依据。</w:t>
+      </w:r>
+    </w:p>
+    <w:p>
+      <w:pPr>
+        <w:pStyle w:val="Compact"/>
+        <w:numPr>
+          <w:ilvl w:val="0"/>
+          <w:numId w:val="1001"/>
+        </w:numPr>
+      </w:pPr>
+      <w:r>
+        <w:rPr>
+          <w:rFonts w:hint="eastAsia"/>
+          <w:b/>
+          <w:bCs/>
+        </w:rPr>
+        <w:t xml:space="preserve">整体旋转</w:t>
+      </w:r>
+      <w:r>
+        <w:rPr>
+          <w:b/>
+          <w:bCs/>
+        </w:rPr>
+        <w:t xml:space="preserve"> R</w:t>
+      </w:r>
+      <w:r>
+        <w:rPr>
+          <w:rFonts w:hint="eastAsia"/>
+        </w:rPr>
+        <w:t xml:space="preserve">：去质心后，最小化</w:t>
+      </w:r>
+      <w:r>
+        <w:t xml:space="preserve"> </w:t>
+      </w:r>
+      <w:r>
+        <w:rPr>
+          <w:rStyle w:val="VerbatimChar"/>
+        </w:rPr>
+        <w:t xml:space="preserve">Σ‖Qᵢ − R·Pᵢ‖²</w:t>
+      </w:r>
+      <w:r>
+        <w:t xml:space="preserve"> </w:t>
+      </w:r>
+      <w:r>
+        <w:rPr>
+          <w:rFonts w:hint="eastAsia"/>
+        </w:rPr>
+        <w:t xml:space="preserve">等价于最大化</w:t>
+      </w:r>
+      <w:r>
+        <w:t xml:space="preserve"> </w:t>
+      </w:r>
+      <w:r>
+        <w:rPr>
+          <w:rStyle w:val="VerbatimChar"/>
+        </w:rPr>
+        <w:t xml:space="preserve">tr(R·H)</w:t>
+      </w:r>
+      <w:r>
+        <w:rPr>
+          <w:rFonts w:hint="eastAsia"/>
+        </w:rPr>
+        <w:t xml:space="preserve">，其中相关矩阵</w:t>
+      </w:r>
+      <w:r>
+        <w:t xml:space="preserve"> </w:t>
+      </w:r>
+      <w:r>
+        <w:rPr>
+          <w:rStyle w:val="VerbatimChar"/>
+        </w:rPr>
+        <w:t xml:space="preserve">H = Σ Pᵢ Qᵢᵀ</w:t>
+      </w:r>
+      <w:r>
+        <w:rPr>
+          <w:rFonts w:hint="eastAsia"/>
+        </w:rPr>
+        <w:t xml:space="preserve">。对</w:t>
+      </w:r>
+      <w:r>
+        <w:t xml:space="preserve"> H </w:t>
+      </w:r>
+      <w:r>
+        <w:rPr>
+          <w:rFonts w:hint="eastAsia"/>
+        </w:rPr>
+        <w:t xml:space="preserve">做奇异值分解</w:t>
+      </w:r>
+      <w:r>
+        <w:t xml:space="preserve"> </w:t>
+      </w:r>
+      <w:r>
+        <w:rPr>
+          <w:rStyle w:val="VerbatimChar"/>
+        </w:rPr>
+        <w:t xml:space="preserve">H = U·Σ·Vᵀ</w:t>
+      </w:r>
+      <w:r>
+        <w:rPr>
+          <w:rFonts w:hint="eastAsia"/>
+        </w:rPr>
+        <w:t xml:space="preserve">，最优旋转为</w:t>
+      </w:r>
+      <w:r>
+        <w:t xml:space="preserve"> </w:t>
+      </w:r>
+      <w:r>
+        <w:rPr>
+          <w:rStyle w:val="VerbatimChar"/>
+        </w:rPr>
+        <w:t xml:space="preserve">R = V·diag(1,1,det(VUᵀ))·Uᵀ</w:t>
+      </w:r>
+      <w:r>
+        <w:t xml:space="preserve">——</w:t>
+      </w:r>
+      <w:r>
+        <w:rPr>
+          <w:rStyle w:val="VerbatimChar"/>
+        </w:rPr>
+        <w:t xml:space="preserve">det</w:t>
+      </w:r>
+      <w:r>
+        <w:t xml:space="preserve"> </w:t>
+      </w:r>
+      <w:r>
+        <w:rPr>
+          <w:rFonts w:hint="eastAsia"/>
+        </w:rPr>
+        <w:t xml:space="preserve">项为</w:t>
+      </w:r>
+      <w:r>
+        <w:rPr>
+          <w:rFonts w:hint="eastAsia"/>
+          <w:b/>
+          <w:bCs/>
+        </w:rPr>
+        <w:t xml:space="preserve">反射保护</w:t>
+      </w:r>
+      <w:r>
+        <w:rPr>
+          <w:rFonts w:hint="eastAsia"/>
+        </w:rPr>
+        <w:t xml:space="preserve">，当</w:t>
+      </w:r>
+      <w:r>
+        <w:t xml:space="preserve"> </w:t>
+      </w:r>
+      <w:r>
+        <w:rPr>
+          <w:rStyle w:val="VerbatimChar"/>
+        </w:rPr>
+        <w:t xml:space="preserve">det(VUᵀ) = −1</w:t>
+      </w:r>
+      <w:r>
+        <w:t xml:space="preserve"> </w:t>
+      </w:r>
+      <w:r>
+        <w:rPr>
+          <w:rFonts w:hint="eastAsia"/>
+        </w:rPr>
+        <w:t xml:space="preserve">时翻转最小奇异值方向以保证</w:t>
+      </w:r>
+      <w:r>
+        <w:t xml:space="preserve"> </w:t>
+      </w:r>
+      <w:r>
+        <w:rPr>
+          <w:rStyle w:val="VerbatimChar"/>
+        </w:rPr>
+        <w:t xml:space="preserve">R</w:t>
+      </w:r>
+      <w:r>
+        <w:t xml:space="preserve"> </w:t>
+      </w:r>
+      <w:r>
+        <w:rPr>
+          <w:rFonts w:hint="eastAsia"/>
+        </w:rPr>
+        <w:t xml:space="preserve">为真旋转（det=+1）而非镜像，且该翻转代价最小。随后把</w:t>
+      </w:r>
+      <w:r>
+        <w:t xml:space="preserve"> R </w:t>
+      </w:r>
+      <w:r>
+        <w:rPr>
+          <w:rFonts w:hint="eastAsia"/>
+        </w:rPr>
+        <w:t xml:space="preserve">经矩阵对数/轴角映射转为</w:t>
+      </w:r>
+      <w:r>
+        <w:rPr>
+          <w:rFonts w:hint="eastAsia"/>
+          <w:b/>
+          <w:bCs/>
+        </w:rPr>
+        <w:t xml:space="preserve">旋转向量</w:t>
+      </w:r>
+      <w:r>
+        <w:t xml:space="preserve"> </w:t>
+      </w:r>
+      <w:r>
+        <w:rPr>
+          <w:rFonts w:hint="eastAsia"/>
+        </w:rPr>
+        <w:t xml:space="preserve">Rx/Ry/Rz（deg）。该解对任意大小转角都精确；仅在</w:t>
+      </w:r>
+      <w:r>
+        <w:t xml:space="preserve"> numpy </w:t>
+      </w:r>
+      <w:r>
+        <w:rPr>
+          <w:rFonts w:hint="eastAsia"/>
+        </w:rPr>
+        <w:t xml:space="preserve">不可用、有效节点少于</w:t>
+      </w:r>
+      <w:r>
+        <w:t xml:space="preserve"> 3 </w:t>
+      </w:r>
+      <w:r>
+        <w:rPr>
+          <w:rFonts w:hint="eastAsia"/>
+        </w:rPr>
+        <w:t xml:space="preserve">或数值异常时回退线性化小角度解。</w:t>
+      </w:r>
+    </w:p>
+    <w:p>
+      <w:pPr>
+        <w:pStyle w:val="Compact"/>
+        <w:numPr>
+          <w:ilvl w:val="0"/>
+          <w:numId w:val="1001"/>
+        </w:numPr>
+      </w:pPr>
+      <w:r>
+        <w:rPr>
+          <w:rFonts w:hint="eastAsia"/>
+          <w:b/>
+          <w:bCs/>
+        </w:rPr>
+        <w:t xml:space="preserve">面形残差</w:t>
+      </w:r>
+      <w:r>
+        <w:rPr>
+          <w:b/>
+          <w:bCs/>
+        </w:rPr>
+        <w:t xml:space="preserve"> RMS</w:t>
+      </w:r>
+      <w:r>
+        <w:rPr>
+          <w:rFonts w:hint="eastAsia"/>
+        </w:rPr>
+        <w:t xml:space="preserve">：</w:t>
+      </w:r>
+      <w:r>
+        <w:rPr>
+          <w:rStyle w:val="VerbatimChar"/>
+        </w:rPr>
+        <w:t xml:space="preserve">RMS = sqrt( (1/n) Σ‖qᵢ − (R·pᵢ + t)‖² )</w:t>
+      </w:r>
+      <w:r>
+        <w:rPr>
+          <w:rFonts w:hint="eastAsia"/>
+        </w:rPr>
+        <w:t xml:space="preserve">，即去除最佳刚体平移+旋转后各节点剩余位移的</w:t>
+      </w:r>
+      <w:r>
+        <w:t xml:space="preserve"> </w:t>
+      </w:r>
+      <w:r>
+        <w:rPr>
+          <w:rFonts w:hint="eastAsia"/>
+        </w:rPr>
+        <w:t xml:space="preserve">RMS，用于衡量该镜片偏离纯刚体的程度。无权、det&gt;0</w:t>
+      </w:r>
+      <w:r>
+        <w:t xml:space="preserve"> </w:t>
+      </w:r>
+      <w:r>
+        <w:rPr>
+          <w:rFonts w:hint="eastAsia"/>
+        </w:rPr>
+        <w:t xml:space="preserve">时有闭式</w:t>
+      </w:r>
+      <w:r>
+        <w:t xml:space="preserve"> </w:t>
+      </w:r>
+      <w:r>
+        <w:rPr>
+          <w:rStyle w:val="VerbatimChar"/>
+        </w:rPr>
+        <w:t xml:space="preserve">Σ‖eᵢ‖² = Σ(‖Pᵢ‖²+‖Qᵢ‖²) − 2(σ₁+σ₂+σ₃)</w:t>
+      </w:r>
+      <w:r>
+        <w:rPr>
+          <w:rFonts w:hint="eastAsia"/>
+        </w:rPr>
+        <w:t xml:space="preserve">。残差越大，说明面形变化越显著、单一刚体位移/旋转越不足以描述真实变形——此时应考虑面形传递（STAR</w:t>
+      </w:r>
+      <w:r>
+        <w:t xml:space="preserve"> / </w:t>
+      </w:r>
+      <w:r>
+        <w:rPr>
+          <w:rFonts w:hint="eastAsia"/>
+        </w:rPr>
+        <w:t xml:space="preserve">网格面形</w:t>
+      </w:r>
+      <w:r>
+        <w:t xml:space="preserve"> / </w:t>
+      </w:r>
+      <w:r>
+        <w:rPr>
+          <w:rFonts w:hint="eastAsia"/>
+        </w:rPr>
+        <w:t xml:space="preserve">Zernike，当前版本不含）。</w:t>
+      </w:r>
+    </w:p>
+    <w:p>
+      <w:pPr>
+        <w:pStyle w:val="BlockText"/>
+      </w:pPr>
+      <w:r>
+        <w:rPr>
+          <w:rFonts w:hint="eastAsia"/>
+        </w:rPr>
+        <w:t xml:space="preserve">退化情形：当镜片节点近似</w:t>
+      </w:r>
+      <w:r>
+        <w:rPr>
+          <w:rFonts w:hint="eastAsia"/>
+          <w:b/>
+          <w:bCs/>
+        </w:rPr>
+        <w:t xml:space="preserve">共线</w:t>
+      </w:r>
+      <w:r>
+        <w:rPr>
+          <w:rFonts w:hint="eastAsia"/>
+        </w:rPr>
+        <w:t xml:space="preserve">时，绕该直线的旋转分量不可观测（σ₃≈σ₂≈0），旋转沿该轴不定；需</w:t>
+      </w:r>
+      <w:r>
+        <w:t xml:space="preserve"> ≥3 </w:t>
+      </w:r>
+      <w:r>
+        <w:rPr>
+          <w:rFonts w:hint="eastAsia"/>
+        </w:rPr>
+        <w:t xml:space="preserve">个非共线节点才能唯一确定三维旋转。</w:t>
+      </w:r>
+    </w:p>
+    <w:p>
+      <w:pPr>
+        <w:pStyle w:val="FirstParagraph"/>
+      </w:pPr>
+      <w:r>
+        <w:rPr>
+          <w:rFonts w:hint="eastAsia"/>
+        </w:rPr>
+        <w:t xml:space="preserve">每镜片输出一条记录：</w:t>
+      </w:r>
+      <w:r>
+        <w:rPr>
+          <w:rStyle w:val="VerbatimChar"/>
+          <w:rFonts w:hint="eastAsia"/>
+        </w:rPr>
+        <w:t xml:space="preserve">名称、X、Y、Z(m)、Rx、Ry、Rz(deg)、面形残差RMS、节点数、来源文件</w:t>
+      </w:r>
+      <w:r>
+        <w:rPr>
+          <w:rFonts w:hint="eastAsia"/>
+        </w:rPr>
+        <w:t xml:space="preserve">，并保存为</w:t>
+      </w:r>
+      <w:r>
+        <w:t xml:space="preserve"> </w:t>
+      </w:r>
+      <w:r>
+        <w:rPr>
+          <w:rStyle w:val="VerbatimChar"/>
+        </w:rPr>
+        <w:t xml:space="preserve">lens_pose_latest.csv</w:t>
+      </w:r>
+      <w:r>
+        <w:t xml:space="preserve"> </w:t>
+      </w:r>
+      <w:r>
+        <w:t xml:space="preserve">/</w:t>
+      </w:r>
+      <w:r>
+        <w:t xml:space="preserve"> </w:t>
+      </w:r>
+      <w:r>
+        <w:rPr>
+          <w:rStyle w:val="VerbatimChar"/>
+        </w:rPr>
+        <w:t xml:space="preserve">lens_pose_time_series.csv</w:t>
+      </w:r>
+      <w:r>
+        <w:t xml:space="preserve"> </w:t>
+      </w:r>
+      <w:r>
+        <w:t xml:space="preserve">/ JSON </w:t>
+      </w:r>
+      <w:r>
+        <w:rPr>
+          <w:rFonts w:hint="eastAsia"/>
+        </w:rPr>
+        <w:t xml:space="preserve">与计算日志。理论推导见</w:t>
+      </w:r>
+      <w:r>
+        <w:t xml:space="preserve"> </w:t>
+      </w:r>
+      <w:r>
+        <w:rPr>
+          <w:rStyle w:val="VerbatimChar"/>
+          <w:rFonts w:hint="eastAsia"/>
+        </w:rPr>
+        <w:t xml:space="preserve">docs/节点位移计算整体位移和旋转_理论公式.md</w:t>
+      </w:r>
+      <w:r>
+        <w:t xml:space="preserve">。</w:t>
+      </w:r>
+    </w:p>
+    <w:p>
+      <w:r>
+        <w:pict>
+          <v:rect style="width:0;height:1.5pt" o:hralign="center" o:hrstd="t" o:hr="t"/>
+        </w:pict>
+      </w:r>
+    </w:p>
+    <w:bookmarkEnd w:id="29"/>
+    <w:bookmarkStart w:id="36" w:name="zemax-工程与非序列导入追迹"/>
+    <w:p>
+      <w:pPr>
+        <w:pStyle w:val="Heading2"/>
+      </w:pPr>
+      <w:r>
+        <w:t xml:space="preserve">7. Zemax </w:t>
+      </w:r>
+      <w:r>
+        <w:rPr>
+          <w:rFonts w:hint="eastAsia"/>
+        </w:rPr>
+        <w:t xml:space="preserve">工程与非序列导入/追迹</w:t>
+      </w:r>
+    </w:p>
+    <w:p>
+      <w:pPr>
+        <w:pStyle w:val="FirstParagraph"/>
+      </w:pPr>
+      <w:r>
+        <w:t xml:space="preserve">Zemax </w:t>
+      </w:r>
+      <w:r>
+        <w:rPr>
+          <w:rFonts w:hint="eastAsia"/>
+        </w:rPr>
+        <w:t xml:space="preserve">页用于选择</w:t>
+      </w:r>
+      <w:r>
+        <w:t xml:space="preserve"> </w:t>
+      </w:r>
+      <w:r>
+        <w:rPr>
+          <w:rStyle w:val="VerbatimChar"/>
+        </w:rPr>
+        <w:t xml:space="preserve">.zmx</w:t>
+      </w:r>
+      <w:r>
+        <w:t xml:space="preserve"> </w:t>
+      </w:r>
+      <w:r>
+        <w:rPr>
+          <w:rFonts w:hint="eastAsia"/>
+        </w:rPr>
+        <w:t xml:space="preserve">工程并做非序列相关操作。当前版本不主动打开</w:t>
+      </w:r>
+      <w:r>
+        <w:t xml:space="preserve"> OpticStudio </w:t>
+      </w:r>
+      <w:r>
+        <w:rPr>
+          <w:rFonts w:hint="eastAsia"/>
+        </w:rPr>
+        <w:t xml:space="preserve">GUI，全程后台</w:t>
+      </w:r>
+      <w:r>
+        <w:t xml:space="preserve"> </w:t>
+      </w:r>
+      <w:r>
+        <w:rPr>
+          <w:rFonts w:hint="eastAsia"/>
+        </w:rPr>
+        <w:t xml:space="preserve">ZOS-API，避免「看到的窗口</w:t>
+      </w:r>
+      <w:r>
+        <w:t xml:space="preserve"> ≠ </w:t>
+      </w:r>
+      <w:r>
+        <w:rPr>
+          <w:rFonts w:hint="eastAsia"/>
+        </w:rPr>
+        <w:t xml:space="preserve">后台会话对象」的不一致。</w:t>
+      </w:r>
+    </w:p>
+    <w:p>
+      <w:pPr>
+        <w:pStyle w:val="CaptionedFigure"/>
+      </w:pPr>
+      <w:r>
+        <w:drawing>
+          <wp:inline>
+            <wp:extent cx="5334000" cy="3557367"/>
+            <wp:effectExtent b="0" l="0" r="0" t="0"/>
+            <wp:docPr descr="Zemax 页面" title="" id="31" name="Picture"/>
+            <a:graphic>
+              <a:graphicData uri="http://schemas.openxmlformats.org/drawingml/2006/picture">
+                <pic:pic>
+                  <pic:nvPicPr>
+                    <pic:cNvPr descr="images/zemax_main_mock.png" id="32" name="Picture"/>
+                    <pic:cNvPicPr>
+                      <a:picLocks noChangeArrowheads="1" noChangeAspect="1"/>
+                    </pic:cNvPicPr>
+                  </pic:nvPicPr>
+                  <pic:blipFill>
+                    <a:blip r:embed="rId30"/>
                     <a:stretch>
                       <a:fillRect/>
                     </a:stretch>
@@ -1706,1306 +3167,6 @@
         <w:pStyle w:val="ImageCaption"/>
       </w:pPr>
       <w:r>
-        <w:t xml:space="preserve">Mechanical </w:t>
-      </w:r>
-      <w:r>
-        <w:rPr>
-          <w:rFonts w:hint="eastAsia"/>
-        </w:rPr>
-        <w:t xml:space="preserve">主界面</w:t>
-      </w:r>
-    </w:p>
-    <w:p>
-      <w:pPr>
-        <w:pStyle w:val="BodyText"/>
-      </w:pPr>
-      <w:r>
-        <w:t xml:space="preserve">Mechanical </w:t>
-      </w:r>
-      <w:r>
-        <w:rPr>
-          <w:rFonts w:hint="eastAsia"/>
-        </w:rPr>
-        <w:t xml:space="preserve">页面顶部是</w:t>
-      </w:r>
-      <w:r>
-        <w:t xml:space="preserve"> Mechanical </w:t>
-      </w:r>
-      <w:r>
-        <w:rPr>
-          <w:rFonts w:hint="eastAsia"/>
-        </w:rPr>
-        <w:t xml:space="preserve">控制台与环境状态。控制台用于选择</w:t>
-      </w:r>
-      <w:r>
-        <w:t xml:space="preserve"> </w:t>
-      </w:r>
-      <w:r>
-        <w:rPr>
-          <w:rStyle w:val="VerbatimChar"/>
-        </w:rPr>
-        <w:t xml:space="preserve">.mechdb</w:t>
-      </w:r>
-      <w:r>
-        <w:t xml:space="preserve"> </w:t>
-      </w:r>
-      <w:r>
-        <w:t xml:space="preserve">/</w:t>
-      </w:r>
-      <w:r>
-        <w:t xml:space="preserve"> </w:t>
-      </w:r>
-      <w:r>
-        <w:rPr>
-          <w:rStyle w:val="VerbatimChar"/>
-        </w:rPr>
-        <w:t xml:space="preserve">.mechdat</w:t>
-      </w:r>
-      <w:r>
-        <w:rPr>
-          <w:rFonts w:hint="eastAsia"/>
-        </w:rPr>
-        <w:t xml:space="preserve">、读取模块、检查环境、打开路径设置以及关闭后台</w:t>
-      </w:r>
-      <w:r>
-        <w:t xml:space="preserve"> </w:t>
-      </w:r>
-      <w:r>
-        <w:rPr>
-          <w:rFonts w:hint="eastAsia"/>
-        </w:rPr>
-        <w:t xml:space="preserve">Mechanical。环境状态单行三列显示当前工程、Zemax</w:t>
-      </w:r>
-      <w:r>
-        <w:t xml:space="preserve"> </w:t>
-      </w:r>
-      <w:r>
-        <w:rPr>
-          <w:rFonts w:hint="eastAsia"/>
-        </w:rPr>
-        <w:t xml:space="preserve">工程、RunWB2、Mechanical、OpticStudio、PyMechanical、pythonnet、PySide6</w:t>
-      </w:r>
-      <w:r>
-        <w:t xml:space="preserve"> </w:t>
-      </w:r>
-      <w:r>
-        <w:rPr>
-          <w:rFonts w:hint="eastAsia"/>
-        </w:rPr>
-        <w:t xml:space="preserve">是否可用，路径过长中间省略、悬停看全。页面中部是当前工程分析模块表（序号、系统名、模块、系统类型、物理场、分析类型、求解器），底部按钮围绕当前选中模块工作。</w:t>
-      </w:r>
-    </w:p>
-    <w:p>
-      <w:r>
-        <w:pict>
-          <v:rect style="width:0;height:1.5pt" o:hralign="center" o:hrstd="t" o:hr="t"/>
-        </w:pict>
-      </w:r>
-    </w:p>
-    <w:bookmarkEnd w:id="17"/>
-    <w:bookmarkStart w:id="18" w:name="mechanical-工作流程"/>
-    <w:p>
-      <w:pPr>
-        <w:pStyle w:val="Heading2"/>
-      </w:pPr>
-      <w:r>
-        <w:t xml:space="preserve">4. Mechanical </w:t>
-      </w:r>
-      <w:r>
-        <w:rPr>
-          <w:rFonts w:hint="eastAsia"/>
-        </w:rPr>
-        <w:t xml:space="preserve">工作流程</w:t>
-      </w:r>
-    </w:p>
-    <w:p>
-      <w:pPr>
-        <w:pStyle w:val="FirstParagraph"/>
-      </w:pPr>
-      <w:r>
-        <w:rPr>
-          <w:rFonts w:hint="eastAsia"/>
-        </w:rPr>
-        <w:t xml:space="preserve">推荐流程：选择</w:t>
-      </w:r>
-      <w:r>
-        <w:t xml:space="preserve"> database → </w:t>
-      </w:r>
-      <w:r>
-        <w:rPr>
-          <w:rFonts w:hint="eastAsia"/>
-        </w:rPr>
-        <w:t xml:space="preserve">读取模块（同时启动并保持后台会话）→</w:t>
-      </w:r>
-      <w:r>
-        <w:t xml:space="preserve"> </w:t>
-      </w:r>
-      <w:r>
-        <w:rPr>
-          <w:rFonts w:hint="eastAsia"/>
-        </w:rPr>
-        <w:t xml:space="preserve">选中目标模块</w:t>
-      </w:r>
-      <w:r>
-        <w:t xml:space="preserve"> → </w:t>
-      </w:r>
-      <w:r>
-        <w:rPr>
-          <w:rFonts w:hint="eastAsia"/>
-        </w:rPr>
-        <w:t xml:space="preserve">读取设置/求解/读取结果/导出。</w:t>
-      </w:r>
-    </w:p>
-    <w:p>
-      <w:pPr>
-        <w:pStyle w:val="BodyText"/>
-      </w:pPr>
-      <w:r>
-        <w:rPr>
-          <w:rFonts w:hint="eastAsia"/>
-        </w:rPr>
-        <w:t xml:space="preserve">选择工程时应选</w:t>
-      </w:r>
-      <w:r>
-        <w:t xml:space="preserve"> </w:t>
-      </w:r>
-      <w:r>
-        <w:rPr>
-          <w:rStyle w:val="VerbatimChar"/>
-        </w:rPr>
-        <w:t xml:space="preserve">.mechdb</w:t>
-      </w:r>
-      <w:r>
-        <w:t xml:space="preserve"> </w:t>
-      </w:r>
-      <w:r>
-        <w:rPr>
-          <w:rFonts w:hint="eastAsia"/>
-        </w:rPr>
-        <w:t xml:space="preserve">或</w:t>
-      </w:r>
-      <w:r>
-        <w:t xml:space="preserve"> </w:t>
-      </w:r>
-      <w:r>
-        <w:rPr>
-          <w:rStyle w:val="VerbatimChar"/>
-        </w:rPr>
-        <w:t xml:space="preserve">.mechdat</w:t>
-      </w:r>
-      <w:r>
-        <w:rPr>
-          <w:rFonts w:hint="eastAsia"/>
-        </w:rPr>
-        <w:t xml:space="preserve">。通过「选择文件」挑选</w:t>
-      </w:r>
-      <w:r>
-        <w:t xml:space="preserve"> database </w:t>
-      </w:r>
-      <w:r>
-        <w:rPr>
-          <w:rFonts w:hint="eastAsia"/>
-        </w:rPr>
-        <w:t xml:space="preserve">时，软件会自动后台启动并保持</w:t>
-      </w:r>
-      <w:r>
-        <w:t xml:space="preserve"> Mechanical </w:t>
-      </w:r>
-      <w:r>
-        <w:rPr>
-          <w:rFonts w:hint="eastAsia"/>
-        </w:rPr>
-        <w:t xml:space="preserve">会话；如果路径已填在输入框中，直接点击「读取模块」也会先启动并保持持久会话、再由该会话读取模块（而不是用一次性临时会话读完即退，否则随后读取/求解/导出会因无会话被拦下）。启动在后台线程执行，界面仍可响应。</w:t>
-      </w:r>
-    </w:p>
-    <w:p>
-      <w:pPr>
-        <w:pStyle w:val="BodyText"/>
-      </w:pPr>
-      <w:r>
-        <w:rPr>
-          <w:rFonts w:hint="eastAsia"/>
-        </w:rPr>
-        <w:t xml:space="preserve">「读取模块」是从会话里真实读取分析对象，不是从文件名猜测。多模块工程（静力、瞬态、随机振动等）必须先在表里选中目标模块再操作，避免把一个模块的设置或结果误用到另一个模块。</w:t>
-      </w:r>
-    </w:p>
-    <w:p>
-      <w:pPr>
-        <w:pStyle w:val="BodyText"/>
-      </w:pPr>
-      <w:r>
-        <w:rPr>
-          <w:rFonts w:hint="eastAsia"/>
-        </w:rPr>
-        <w:t xml:space="preserve">关闭</w:t>
-      </w:r>
-      <w:r>
-        <w:t xml:space="preserve"> Mechanical </w:t>
-      </w:r>
-      <w:r>
-        <w:rPr>
-          <w:rFonts w:hint="eastAsia"/>
-        </w:rPr>
-        <w:t xml:space="preserve">时提供「保存后关闭」「不保存关闭」「取消」三种选择，避免强杀进程造成</w:t>
-      </w:r>
-      <w:r>
-        <w:t xml:space="preserve"> database </w:t>
-      </w:r>
-      <w:r>
-        <w:rPr>
-          <w:rFonts w:hint="eastAsia"/>
-        </w:rPr>
-        <w:t xml:space="preserve">锁或工程损坏。软件不会绕过</w:t>
-      </w:r>
-      <w:r>
-        <w:t xml:space="preserve"> Mechanical </w:t>
-      </w:r>
-      <w:r>
-        <w:rPr>
-          <w:rFonts w:hint="eastAsia"/>
-        </w:rPr>
-        <w:t xml:space="preserve">自身的保存过程。</w:t>
-      </w:r>
-    </w:p>
-    <w:p>
-      <w:r>
-        <w:pict>
-          <v:rect style="width:0;height:1.5pt" o:hralign="center" o:hrstd="t" o:hr="t"/>
-        </w:pict>
-      </w:r>
-    </w:p>
-    <w:bookmarkEnd w:id="18"/>
-    <w:bookmarkStart w:id="22" w:name="设置求解与结果"/>
-    <w:p>
-      <w:pPr>
-        <w:pStyle w:val="Heading2"/>
-      </w:pPr>
-      <w:r>
-        <w:t xml:space="preserve">5. </w:t>
-      </w:r>
-      <w:r>
-        <w:rPr>
-          <w:rFonts w:hint="eastAsia"/>
-        </w:rPr>
-        <w:t xml:space="preserve">设置、求解与结果</w:t>
-      </w:r>
-    </w:p>
-    <w:p>
-      <w:pPr>
-        <w:pStyle w:val="FirstParagraph"/>
-      </w:pPr>
-      <w:r>
-        <w:rPr>
-          <w:rFonts w:hint="eastAsia"/>
-        </w:rPr>
-        <w:t xml:space="preserve">点击「读取设置」打开设置窗口，数据来自当前</w:t>
-      </w:r>
-      <w:r>
-        <w:t xml:space="preserve"> Mechanical </w:t>
-      </w:r>
-      <w:r>
-        <w:rPr>
-          <w:rFonts w:hint="eastAsia"/>
-        </w:rPr>
-        <w:t xml:space="preserve">会话的真实属性（</w:t>
-      </w:r>
-      <w:r>
-        <w:rPr>
-          <w:rStyle w:val="VerbatimChar"/>
-        </w:rPr>
-        <w:t xml:space="preserve">AnalysisSettings.VisibleProperties</w:t>
-      </w:r>
-      <w:r>
-        <w:rPr>
-          <w:rFonts w:hint="eastAsia"/>
-        </w:rPr>
-        <w:t xml:space="preserve">），按属性类型（数字/布尔/枚举/文本）生成控件，而非写死模板；同时读取该模块下已加入的分析条件（力、温度、重力、约束、热边界等）。常见于瞬态、随机振动的</w:t>
-      </w:r>
-      <w:r>
-        <w:t xml:space="preserve"> Tabular Data </w:t>
-      </w:r>
-      <w:r>
-        <w:rPr>
-          <w:rFonts w:hint="eastAsia"/>
-        </w:rPr>
-        <w:t xml:space="preserve">支持读取、从</w:t>
-      </w:r>
-      <w:r>
-        <w:t xml:space="preserve"> Excel/CSV/TXT </w:t>
-      </w:r>
-      <w:r>
-        <w:rPr>
-          <w:rFonts w:hint="eastAsia"/>
-        </w:rPr>
-        <w:t xml:space="preserve">导入、打开当前</w:t>
-      </w:r>
-      <w:r>
-        <w:t xml:space="preserve"> </w:t>
-      </w:r>
-      <w:r>
-        <w:rPr>
-          <w:rFonts w:hint="eastAsia"/>
-        </w:rPr>
-        <w:t xml:space="preserve">Excel——推荐导出成外部表格在</w:t>
-      </w:r>
-      <w:r>
-        <w:t xml:space="preserve"> Excel </w:t>
-      </w:r>
-      <w:r>
-        <w:rPr>
-          <w:rFonts w:hint="eastAsia"/>
-        </w:rPr>
-        <w:t xml:space="preserve">里改好再导入。</w:t>
-      </w:r>
-    </w:p>
-    <w:p>
-      <w:pPr>
-        <w:pStyle w:val="BodyText"/>
-      </w:pPr>
-      <w:r>
-        <w:rPr>
-          <w:rFonts w:hint="eastAsia"/>
-        </w:rPr>
-        <w:t xml:space="preserve">「保存设置」只写回当前后台会话，不立即写盘</w:t>
-      </w:r>
-      <w:r>
-        <w:t xml:space="preserve"> database </w:t>
-      </w:r>
-      <w:r>
-        <w:rPr>
-          <w:rFonts w:hint="eastAsia"/>
-        </w:rPr>
-        <w:t xml:space="preserve">文件；是否落盘由关闭</w:t>
-      </w:r>
-      <w:r>
-        <w:t xml:space="preserve"> Mechanical </w:t>
-      </w:r>
-      <w:r>
-        <w:rPr>
-          <w:rFonts w:hint="eastAsia"/>
-        </w:rPr>
-        <w:t xml:space="preserve">时选择，避免每改一格就触发长时间保存。</w:t>
-      </w:r>
-    </w:p>
-    <w:p>
-      <w:pPr>
-        <w:pStyle w:val="BodyText"/>
-      </w:pPr>
-      <w:r>
-        <w:rPr>
-          <w:rFonts w:hint="eastAsia"/>
-        </w:rPr>
-        <w:t xml:space="preserve">点击「求解模块」会通过当前会话求解，</w:t>
-      </w:r>
-      <w:r>
-        <w:rPr>
-          <w:rFonts w:hint="eastAsia"/>
-          <w:b/>
-          <w:bCs/>
-        </w:rPr>
-        <w:t xml:space="preserve">求解前自动清除该模块已有结果</w:t>
-      </w:r>
-      <w:r>
-        <w:rPr>
-          <w:rFonts w:hint="eastAsia"/>
-        </w:rPr>
-        <w:t xml:space="preserve">（保证结果对应当前设置；旧结果需保留的请先备份）。求解在后台线程执行，「当前操作」面板显示阶段/状态/用时。求解失败时日志显示</w:t>
-      </w:r>
-      <w:r>
-        <w:t xml:space="preserve"> Mechanical </w:t>
-      </w:r>
-      <w:r>
-        <w:rPr>
-          <w:rFonts w:hint="eastAsia"/>
-        </w:rPr>
-        <w:t xml:space="preserve">返回的错误（约束不足、接触/材料/网格/载荷问题、结果表达式错误、许可证不足等），软件不会自动修改物理模型来掩盖错误。</w:t>
-      </w:r>
-    </w:p>
-    <w:p>
-      <w:pPr>
-        <w:pStyle w:val="CaptionedFigure"/>
-      </w:pPr>
-      <w:r>
-        <w:drawing>
-          <wp:inline>
-            <wp:extent cx="5334000" cy="3557367"/>
-            <wp:effectExtent b="0" l="0" r="0" t="0"/>
-            <wp:docPr descr="Mechanical 求解中" title="" id="20" name="Picture"/>
-            <a:graphic>
-              <a:graphicData uri="http://schemas.openxmlformats.org/drawingml/2006/picture">
-                <pic:pic>
-                  <pic:nvPicPr>
-                    <pic:cNvPr descr="images/mechanical_solve_mock.png" id="21" name="Picture"/>
-                    <pic:cNvPicPr>
-                      <a:picLocks noChangeArrowheads="1" noChangeAspect="1"/>
-                    </pic:cNvPicPr>
-                  </pic:nvPicPr>
-                  <pic:blipFill>
-                    <a:blip r:embed="rId19"/>
-                    <a:stretch>
-                      <a:fillRect/>
-                    </a:stretch>
-                  </pic:blipFill>
-                  <pic:spPr bwMode="auto">
-                    <a:xfrm>
-                      <a:off x="0" y="0"/>
-                      <a:ext cx="5334000" cy="3557367"/>
-                    </a:xfrm>
-                    <a:prstGeom prst="rect">
-                      <a:avLst/>
-                    </a:prstGeom>
-                    <a:noFill/>
-                    <a:ln w="9525">
-                      <a:noFill/>
-                      <a:headEnd/>
-                      <a:tailEnd/>
-                    </a:ln>
-                  </pic:spPr>
-                </pic:pic>
-              </a:graphicData>
-            </a:graphic>
-          </wp:inline>
-        </w:drawing>
-      </w:r>
-    </w:p>
-    <w:p>
-      <w:pPr>
-        <w:pStyle w:val="ImageCaption"/>
-      </w:pPr>
-      <w:r>
-        <w:t xml:space="preserve">Mechanical </w:t>
-      </w:r>
-      <w:r>
-        <w:rPr>
-          <w:rFonts w:hint="eastAsia"/>
-        </w:rPr>
-        <w:t xml:space="preserve">求解中</w:t>
-      </w:r>
-    </w:p>
-    <w:p>
-      <w:pPr>
-        <w:pStyle w:val="BodyText"/>
-      </w:pPr>
-      <w:r>
-        <w:rPr>
-          <w:rFonts w:hint="eastAsia"/>
-        </w:rPr>
-        <w:t xml:space="preserve">点击「读取结果」以当前模块为范围列出求解设置、分析条件与</w:t>
-      </w:r>
-      <w:r>
-        <w:t xml:space="preserve"> Solution </w:t>
-      </w:r>
-      <w:r>
-        <w:rPr>
-          <w:rFonts w:hint="eastAsia"/>
-        </w:rPr>
-        <w:t xml:space="preserve">结果对象。可把单个结果导出为</w:t>
-      </w:r>
-      <w:r>
-        <w:t xml:space="preserve"> </w:t>
-      </w:r>
-      <w:r>
-        <w:rPr>
-          <w:rFonts w:hint="eastAsia"/>
-        </w:rPr>
-        <w:t xml:space="preserve">TXT（位移/形变/力/应力等，供后续位移/旋转换算）或</w:t>
-      </w:r>
-      <w:r>
-        <w:t xml:space="preserve"> </w:t>
-      </w:r>
-      <w:r>
-        <w:rPr>
-          <w:rFonts w:hint="eastAsia"/>
-        </w:rPr>
-        <w:t xml:space="preserve">PNG（结果云图），时间/频率相关结果支持按开始/结束/间隔导出序列。</w:t>
-      </w:r>
-      <w:r>
-        <w:rPr>
-          <w:rFonts w:hint="eastAsia"/>
-          <w:b/>
-          <w:bCs/>
-        </w:rPr>
-        <w:t xml:space="preserve">用于联动的</w:t>
-      </w:r>
-      <w:r>
-        <w:rPr>
-          <w:b/>
-          <w:bCs/>
-        </w:rPr>
-        <w:t xml:space="preserve"> TXT </w:t>
-      </w:r>
-      <w:r>
-        <w:rPr>
-          <w:rFonts w:hint="eastAsia"/>
-          <w:b/>
-          <w:bCs/>
-        </w:rPr>
-        <w:t xml:space="preserve">必须包含节点原始坐标</w:t>
-      </w:r>
-      <w:r>
-        <w:rPr>
-          <w:b/>
-          <w:bCs/>
-        </w:rPr>
-        <w:t xml:space="preserve"> X/Y/Z </w:t>
-      </w:r>
-      <w:r>
-        <w:rPr>
-          <w:rFonts w:hint="eastAsia"/>
-          <w:b/>
-          <w:bCs/>
-        </w:rPr>
-        <w:t xml:space="preserve">与三方向位移</w:t>
-      </w:r>
-      <w:r>
-        <w:rPr>
-          <w:b/>
-          <w:bCs/>
-        </w:rPr>
-        <w:t xml:space="preserve"> UX/UY/UZ</w:t>
-      </w:r>
-      <w:r>
-        <w:rPr>
-          <w:rFonts w:hint="eastAsia"/>
-        </w:rPr>
-        <w:t xml:space="preserve">，否则只能算平移、无法拟合旋转。</w:t>
-      </w:r>
-    </w:p>
-    <w:p>
-      <w:r>
-        <w:pict>
-          <v:rect style="width:0;height:1.5pt" o:hralign="center" o:hrstd="t" o:hr="t"/>
-        </w:pict>
-      </w:r>
-    </w:p>
-    <w:bookmarkEnd w:id="22"/>
-    <w:bookmarkStart w:id="23" w:name="节点位移到镜片刚体位移旋转"/>
-    <w:p>
-      <w:pPr>
-        <w:pStyle w:val="Heading2"/>
-      </w:pPr>
-      <w:r>
-        <w:t xml:space="preserve">6. </w:t>
-      </w:r>
-      <w:r>
-        <w:rPr>
-          <w:rFonts w:hint="eastAsia"/>
-        </w:rPr>
-        <w:t xml:space="preserve">节点位移到镜片刚体位移/旋转</w:t>
-      </w:r>
-    </w:p>
-    <w:p>
-      <w:pPr>
-        <w:pStyle w:val="FirstParagraph"/>
-      </w:pPr>
-      <w:r>
-        <w:t xml:space="preserve">Mechanical </w:t>
-      </w:r>
-      <w:r>
-        <w:rPr>
-          <w:rFonts w:hint="eastAsia"/>
-        </w:rPr>
-        <w:t xml:space="preserve">给出节点级位移</w:t>
-      </w:r>
-      <w:r>
-        <w:t xml:space="preserve"> </w:t>
-      </w:r>
-      <w:r>
-        <w:rPr>
-          <w:rStyle w:val="VerbatimChar"/>
-        </w:rPr>
-        <w:t xml:space="preserve">uᵢ</w:t>
-      </w:r>
-      <w:r>
-        <w:rPr>
-          <w:rFonts w:hint="eastAsia"/>
-        </w:rPr>
-        <w:t xml:space="preserve">，Zemax</w:t>
-      </w:r>
-      <w:r>
-        <w:t xml:space="preserve"> </w:t>
-      </w:r>
-      <w:r>
-        <w:rPr>
-          <w:rFonts w:hint="eastAsia"/>
-        </w:rPr>
-        <w:t xml:space="preserve">非序列对象需要的是元件的整体刚体位移/旋转——横向偏心（decenter）、沿光轴离焦（despace）与倾斜（tilt）。软件把某镜片对应的一组节点当作刚体点云，求一个刚体变换</w:t>
-      </w:r>
-      <w:r>
-        <w:t xml:space="preserve"> </w:t>
-      </w:r>
-      <w:r>
-        <w:rPr>
-          <w:rStyle w:val="VerbatimChar"/>
-        </w:rPr>
-        <w:t xml:space="preserve">qᵢ ≈ R·pᵢ + t</w:t>
-      </w:r>
-      <w:r>
-        <w:rPr>
-          <w:rFonts w:hint="eastAsia"/>
-        </w:rPr>
-        <w:t xml:space="preserve">（</w:t>
-      </w:r>
-      <w:r>
-        <w:rPr>
-          <w:rStyle w:val="VerbatimChar"/>
-        </w:rPr>
-        <w:t xml:space="preserve">pᵢ</w:t>
-      </w:r>
-      <w:r>
-        <w:t xml:space="preserve"> </w:t>
-      </w:r>
-      <w:r>
-        <w:rPr>
-          <w:rFonts w:hint="eastAsia"/>
-        </w:rPr>
-        <w:t xml:space="preserve">原始坐标、</w:t>
-      </w:r>
-      <w:r>
-        <w:rPr>
-          <w:rStyle w:val="VerbatimChar"/>
-        </w:rPr>
-        <w:t xml:space="preserve">qᵢ = pᵢ + uᵢ</w:t>
-      </w:r>
-      <w:r>
-        <w:t xml:space="preserve"> </w:t>
-      </w:r>
-      <w:r>
-        <w:rPr>
-          <w:rFonts w:hint="eastAsia"/>
-        </w:rPr>
-        <w:t xml:space="preserve">变形后坐标）使其逼近所有节点的实际变形。这在数学上是带正交约束的最小二乘（正交</w:t>
-      </w:r>
-      <w:r>
-        <w:t xml:space="preserve"> Procrustes / </w:t>
-      </w:r>
-      <w:r>
-        <w:rPr>
-          <w:rFonts w:hint="eastAsia"/>
-        </w:rPr>
-        <w:t xml:space="preserve">Kabsch）问题：</w:t>
-      </w:r>
-    </w:p>
-    <w:p>
-      <w:pPr>
-        <w:pStyle w:val="Compact"/>
-        <w:numPr>
-          <w:ilvl w:val="0"/>
-          <w:numId w:val="1001"/>
-        </w:numPr>
-      </w:pPr>
-      <w:r>
-        <w:rPr>
-          <w:rFonts w:hint="eastAsia"/>
-          <w:b/>
-          <w:bCs/>
-        </w:rPr>
-        <w:t xml:space="preserve">整体平移</w:t>
-      </w:r>
-      <w:r>
-        <w:rPr>
-          <w:b/>
-          <w:bCs/>
-        </w:rPr>
-        <w:t xml:space="preserve"> t</w:t>
-      </w:r>
-      <w:r>
-        <w:rPr>
-          <w:rFonts w:hint="eastAsia"/>
-        </w:rPr>
-        <w:t xml:space="preserve">：固定</w:t>
-      </w:r>
-      <w:r>
-        <w:t xml:space="preserve"> R </w:t>
-      </w:r>
-      <w:r>
-        <w:rPr>
-          <w:rFonts w:hint="eastAsia"/>
-        </w:rPr>
-        <w:t xml:space="preserve">对</w:t>
-      </w:r>
-      <w:r>
-        <w:t xml:space="preserve"> t </w:t>
-      </w:r>
-      <w:r>
-        <w:rPr>
-          <w:rFonts w:hint="eastAsia"/>
-        </w:rPr>
-        <w:t xml:space="preserve">求极值得</w:t>
-      </w:r>
-      <w:r>
-        <w:t xml:space="preserve"> </w:t>
-      </w:r>
-      <w:r>
-        <w:rPr>
-          <w:rStyle w:val="VerbatimChar"/>
-        </w:rPr>
-        <w:t xml:space="preserve">t = q̄ − R·p̄</w:t>
-      </w:r>
-      <w:r>
-        <w:rPr>
-          <w:rFonts w:hint="eastAsia"/>
-        </w:rPr>
-        <w:t xml:space="preserve">（变形前后质心之差），物理上即把原始质心旋转后对齐到变形后质心。横向分量即偏心、沿光轴分量即离焦。代回后目标函数只剩纯旋转项，这就是「先质心平移、再绕质心拟合旋转」的依据。</w:t>
-      </w:r>
-    </w:p>
-    <w:p>
-      <w:pPr>
-        <w:pStyle w:val="Compact"/>
-        <w:numPr>
-          <w:ilvl w:val="0"/>
-          <w:numId w:val="1001"/>
-        </w:numPr>
-      </w:pPr>
-      <w:r>
-        <w:rPr>
-          <w:rFonts w:hint="eastAsia"/>
-          <w:b/>
-          <w:bCs/>
-        </w:rPr>
-        <w:t xml:space="preserve">整体旋转</w:t>
-      </w:r>
-      <w:r>
-        <w:rPr>
-          <w:b/>
-          <w:bCs/>
-        </w:rPr>
-        <w:t xml:space="preserve"> R</w:t>
-      </w:r>
-      <w:r>
-        <w:rPr>
-          <w:rFonts w:hint="eastAsia"/>
-        </w:rPr>
-        <w:t xml:space="preserve">：去质心后，最小化</w:t>
-      </w:r>
-      <w:r>
-        <w:t xml:space="preserve"> </w:t>
-      </w:r>
-      <w:r>
-        <w:rPr>
-          <w:rStyle w:val="VerbatimChar"/>
-        </w:rPr>
-        <w:t xml:space="preserve">Σ‖Qᵢ − R·Pᵢ‖²</w:t>
-      </w:r>
-      <w:r>
-        <w:t xml:space="preserve"> </w:t>
-      </w:r>
-      <w:r>
-        <w:rPr>
-          <w:rFonts w:hint="eastAsia"/>
-        </w:rPr>
-        <w:t xml:space="preserve">等价于最大化</w:t>
-      </w:r>
-      <w:r>
-        <w:t xml:space="preserve"> </w:t>
-      </w:r>
-      <w:r>
-        <w:rPr>
-          <w:rStyle w:val="VerbatimChar"/>
-        </w:rPr>
-        <w:t xml:space="preserve">tr(R·H)</w:t>
-      </w:r>
-      <w:r>
-        <w:rPr>
-          <w:rFonts w:hint="eastAsia"/>
-        </w:rPr>
-        <w:t xml:space="preserve">，其中相关矩阵</w:t>
-      </w:r>
-      <w:r>
-        <w:t xml:space="preserve"> </w:t>
-      </w:r>
-      <w:r>
-        <w:rPr>
-          <w:rStyle w:val="VerbatimChar"/>
-        </w:rPr>
-        <w:t xml:space="preserve">H = Σ Pᵢ Qᵢᵀ</w:t>
-      </w:r>
-      <w:r>
-        <w:rPr>
-          <w:rFonts w:hint="eastAsia"/>
-        </w:rPr>
-        <w:t xml:space="preserve">。对</w:t>
-      </w:r>
-      <w:r>
-        <w:t xml:space="preserve"> H </w:t>
-      </w:r>
-      <w:r>
-        <w:rPr>
-          <w:rFonts w:hint="eastAsia"/>
-        </w:rPr>
-        <w:t xml:space="preserve">做奇异值分解</w:t>
-      </w:r>
-      <w:r>
-        <w:t xml:space="preserve"> </w:t>
-      </w:r>
-      <w:r>
-        <w:rPr>
-          <w:rStyle w:val="VerbatimChar"/>
-        </w:rPr>
-        <w:t xml:space="preserve">H = U·Σ·Vᵀ</w:t>
-      </w:r>
-      <w:r>
-        <w:rPr>
-          <w:rFonts w:hint="eastAsia"/>
-        </w:rPr>
-        <w:t xml:space="preserve">，最优旋转为</w:t>
-      </w:r>
-      <w:r>
-        <w:t xml:space="preserve"> </w:t>
-      </w:r>
-      <w:r>
-        <w:rPr>
-          <w:rStyle w:val="VerbatimChar"/>
-        </w:rPr>
-        <w:t xml:space="preserve">R = V·diag(1,1,det(VUᵀ))·Uᵀ</w:t>
-      </w:r>
-      <w:r>
-        <w:t xml:space="preserve">——</w:t>
-      </w:r>
-      <w:r>
-        <w:rPr>
-          <w:rStyle w:val="VerbatimChar"/>
-        </w:rPr>
-        <w:t xml:space="preserve">det</w:t>
-      </w:r>
-      <w:r>
-        <w:t xml:space="preserve"> </w:t>
-      </w:r>
-      <w:r>
-        <w:rPr>
-          <w:rFonts w:hint="eastAsia"/>
-        </w:rPr>
-        <w:t xml:space="preserve">项为</w:t>
-      </w:r>
-      <w:r>
-        <w:rPr>
-          <w:rFonts w:hint="eastAsia"/>
-          <w:b/>
-          <w:bCs/>
-        </w:rPr>
-        <w:t xml:space="preserve">反射保护</w:t>
-      </w:r>
-      <w:r>
-        <w:rPr>
-          <w:rFonts w:hint="eastAsia"/>
-        </w:rPr>
-        <w:t xml:space="preserve">，当</w:t>
-      </w:r>
-      <w:r>
-        <w:t xml:space="preserve"> </w:t>
-      </w:r>
-      <w:r>
-        <w:rPr>
-          <w:rStyle w:val="VerbatimChar"/>
-        </w:rPr>
-        <w:t xml:space="preserve">det(VUᵀ) = −1</w:t>
-      </w:r>
-      <w:r>
-        <w:t xml:space="preserve"> </w:t>
-      </w:r>
-      <w:r>
-        <w:rPr>
-          <w:rFonts w:hint="eastAsia"/>
-        </w:rPr>
-        <w:t xml:space="preserve">时翻转最小奇异值方向以保证</w:t>
-      </w:r>
-      <w:r>
-        <w:t xml:space="preserve"> </w:t>
-      </w:r>
-      <w:r>
-        <w:rPr>
-          <w:rStyle w:val="VerbatimChar"/>
-        </w:rPr>
-        <w:t xml:space="preserve">R</w:t>
-      </w:r>
-      <w:r>
-        <w:t xml:space="preserve"> </w:t>
-      </w:r>
-      <w:r>
-        <w:rPr>
-          <w:rFonts w:hint="eastAsia"/>
-        </w:rPr>
-        <w:t xml:space="preserve">为真旋转（det=+1）而非镜像，且该翻转代价最小。随后把</w:t>
-      </w:r>
-      <w:r>
-        <w:t xml:space="preserve"> R </w:t>
-      </w:r>
-      <w:r>
-        <w:rPr>
-          <w:rFonts w:hint="eastAsia"/>
-        </w:rPr>
-        <w:t xml:space="preserve">经矩阵对数/轴角映射转为</w:t>
-      </w:r>
-      <w:r>
-        <w:rPr>
-          <w:rFonts w:hint="eastAsia"/>
-          <w:b/>
-          <w:bCs/>
-        </w:rPr>
-        <w:t xml:space="preserve">旋转向量</w:t>
-      </w:r>
-      <w:r>
-        <w:t xml:space="preserve"> </w:t>
-      </w:r>
-      <w:r>
-        <w:rPr>
-          <w:rFonts w:hint="eastAsia"/>
-        </w:rPr>
-        <w:t xml:space="preserve">Rx/Ry/Rz（deg）。该解对任意大小转角都精确；仅在</w:t>
-      </w:r>
-      <w:r>
-        <w:t xml:space="preserve"> numpy </w:t>
-      </w:r>
-      <w:r>
-        <w:rPr>
-          <w:rFonts w:hint="eastAsia"/>
-        </w:rPr>
-        <w:t xml:space="preserve">不可用、有效节点少于</w:t>
-      </w:r>
-      <w:r>
-        <w:t xml:space="preserve"> 3 </w:t>
-      </w:r>
-      <w:r>
-        <w:rPr>
-          <w:rFonts w:hint="eastAsia"/>
-        </w:rPr>
-        <w:t xml:space="preserve">或数值异常时回退线性化小角度解。</w:t>
-      </w:r>
-    </w:p>
-    <w:p>
-      <w:pPr>
-        <w:pStyle w:val="Compact"/>
-        <w:numPr>
-          <w:ilvl w:val="0"/>
-          <w:numId w:val="1001"/>
-        </w:numPr>
-      </w:pPr>
-      <w:r>
-        <w:rPr>
-          <w:rFonts w:hint="eastAsia"/>
-          <w:b/>
-          <w:bCs/>
-        </w:rPr>
-        <w:t xml:space="preserve">面形残差</w:t>
-      </w:r>
-      <w:r>
-        <w:rPr>
-          <w:b/>
-          <w:bCs/>
-        </w:rPr>
-        <w:t xml:space="preserve"> RMS</w:t>
-      </w:r>
-      <w:r>
-        <w:rPr>
-          <w:rFonts w:hint="eastAsia"/>
-        </w:rPr>
-        <w:t xml:space="preserve">：</w:t>
-      </w:r>
-      <w:r>
-        <w:rPr>
-          <w:rStyle w:val="VerbatimChar"/>
-        </w:rPr>
-        <w:t xml:space="preserve">RMS = sqrt( (1/n) Σ‖qᵢ − (R·pᵢ + t)‖² )</w:t>
-      </w:r>
-      <w:r>
-        <w:rPr>
-          <w:rFonts w:hint="eastAsia"/>
-        </w:rPr>
-        <w:t xml:space="preserve">，即去除最佳刚体平移+旋转后各节点剩余位移的</w:t>
-      </w:r>
-      <w:r>
-        <w:t xml:space="preserve"> </w:t>
-      </w:r>
-      <w:r>
-        <w:rPr>
-          <w:rFonts w:hint="eastAsia"/>
-        </w:rPr>
-        <w:t xml:space="preserve">RMS，用于衡量该镜片偏离纯刚体的程度。无权、det&gt;0</w:t>
-      </w:r>
-      <w:r>
-        <w:t xml:space="preserve"> </w:t>
-      </w:r>
-      <w:r>
-        <w:rPr>
-          <w:rFonts w:hint="eastAsia"/>
-        </w:rPr>
-        <w:t xml:space="preserve">时有闭式</w:t>
-      </w:r>
-      <w:r>
-        <w:t xml:space="preserve"> </w:t>
-      </w:r>
-      <w:r>
-        <w:rPr>
-          <w:rStyle w:val="VerbatimChar"/>
-        </w:rPr>
-        <w:t xml:space="preserve">Σ‖eᵢ‖² = Σ(‖Pᵢ‖²+‖Qᵢ‖²) − 2(σ₁+σ₂+σ₃)</w:t>
-      </w:r>
-      <w:r>
-        <w:rPr>
-          <w:rFonts w:hint="eastAsia"/>
-        </w:rPr>
-        <w:t xml:space="preserve">。残差越大，说明面形变化越显著、单一刚体位移/旋转越不足以描述真实变形——此时应考虑面形传递（STAR</w:t>
-      </w:r>
-      <w:r>
-        <w:t xml:space="preserve"> / </w:t>
-      </w:r>
-      <w:r>
-        <w:rPr>
-          <w:rFonts w:hint="eastAsia"/>
-        </w:rPr>
-        <w:t xml:space="preserve">网格面形</w:t>
-      </w:r>
-      <w:r>
-        <w:t xml:space="preserve"> / </w:t>
-      </w:r>
-      <w:r>
-        <w:rPr>
-          <w:rFonts w:hint="eastAsia"/>
-        </w:rPr>
-        <w:t xml:space="preserve">Zernike，当前版本不含）。</w:t>
-      </w:r>
-    </w:p>
-    <w:p>
-      <w:pPr>
-        <w:pStyle w:val="BlockText"/>
-      </w:pPr>
-      <w:r>
-        <w:rPr>
-          <w:rFonts w:hint="eastAsia"/>
-        </w:rPr>
-        <w:t xml:space="preserve">退化情形：当镜片节点近似</w:t>
-      </w:r>
-      <w:r>
-        <w:rPr>
-          <w:rFonts w:hint="eastAsia"/>
-          <w:b/>
-          <w:bCs/>
-        </w:rPr>
-        <w:t xml:space="preserve">共线</w:t>
-      </w:r>
-      <w:r>
-        <w:rPr>
-          <w:rFonts w:hint="eastAsia"/>
-        </w:rPr>
-        <w:t xml:space="preserve">时，绕该直线的旋转分量不可观测（σ₃≈σ₂≈0），旋转沿该轴不定；需</w:t>
-      </w:r>
-      <w:r>
-        <w:t xml:space="preserve"> ≥3 </w:t>
-      </w:r>
-      <w:r>
-        <w:rPr>
-          <w:rFonts w:hint="eastAsia"/>
-        </w:rPr>
-        <w:t xml:space="preserve">个非共线节点才能唯一确定三维旋转。</w:t>
-      </w:r>
-    </w:p>
-    <w:p>
-      <w:pPr>
-        <w:pStyle w:val="FirstParagraph"/>
-      </w:pPr>
-      <w:r>
-        <w:rPr>
-          <w:rFonts w:hint="eastAsia"/>
-        </w:rPr>
-        <w:t xml:space="preserve">每镜片输出一条记录：</w:t>
-      </w:r>
-      <w:r>
-        <w:rPr>
-          <w:rStyle w:val="VerbatimChar"/>
-          <w:rFonts w:hint="eastAsia"/>
-        </w:rPr>
-        <w:t xml:space="preserve">名称、X、Y、Z(m)、Rx、Ry、Rz(deg)、面形残差RMS、节点数、来源文件</w:t>
-      </w:r>
-      <w:r>
-        <w:rPr>
-          <w:rFonts w:hint="eastAsia"/>
-        </w:rPr>
-        <w:t xml:space="preserve">，并保存为</w:t>
-      </w:r>
-      <w:r>
-        <w:t xml:space="preserve"> </w:t>
-      </w:r>
-      <w:r>
-        <w:rPr>
-          <w:rStyle w:val="VerbatimChar"/>
-        </w:rPr>
-        <w:t xml:space="preserve">lens_pose_latest.csv</w:t>
-      </w:r>
-      <w:r>
-        <w:t xml:space="preserve"> </w:t>
-      </w:r>
-      <w:r>
-        <w:t xml:space="preserve">/</w:t>
-      </w:r>
-      <w:r>
-        <w:t xml:space="preserve"> </w:t>
-      </w:r>
-      <w:r>
-        <w:rPr>
-          <w:rStyle w:val="VerbatimChar"/>
-        </w:rPr>
-        <w:t xml:space="preserve">lens_pose_time_series.csv</w:t>
-      </w:r>
-      <w:r>
-        <w:t xml:space="preserve"> </w:t>
-      </w:r>
-      <w:r>
-        <w:t xml:space="preserve">/ JSON </w:t>
-      </w:r>
-      <w:r>
-        <w:rPr>
-          <w:rFonts w:hint="eastAsia"/>
-        </w:rPr>
-        <w:t xml:space="preserve">与计算日志。理论推导见</w:t>
-      </w:r>
-      <w:r>
-        <w:t xml:space="preserve"> </w:t>
-      </w:r>
-      <w:r>
-        <w:rPr>
-          <w:rStyle w:val="VerbatimChar"/>
-          <w:rFonts w:hint="eastAsia"/>
-        </w:rPr>
-        <w:t xml:space="preserve">docs/节点位移计算整体位移和旋转_理论公式.md</w:t>
-      </w:r>
-      <w:r>
-        <w:t xml:space="preserve">。</w:t>
-      </w:r>
-    </w:p>
-    <w:p>
-      <w:r>
-        <w:pict>
-          <v:rect style="width:0;height:1.5pt" o:hralign="center" o:hrstd="t" o:hr="t"/>
-        </w:pict>
-      </w:r>
-    </w:p>
-    <w:bookmarkEnd w:id="23"/>
-    <w:bookmarkStart w:id="27" w:name="zemax-工程与非序列导入追迹"/>
-    <w:p>
-      <w:pPr>
-        <w:pStyle w:val="Heading2"/>
-      </w:pPr>
-      <w:r>
-        <w:t xml:space="preserve">7. Zemax </w:t>
-      </w:r>
-      <w:r>
-        <w:rPr>
-          <w:rFonts w:hint="eastAsia"/>
-        </w:rPr>
-        <w:t xml:space="preserve">工程与非序列导入/追迹</w:t>
-      </w:r>
-    </w:p>
-    <w:p>
-      <w:pPr>
-        <w:pStyle w:val="FirstParagraph"/>
-      </w:pPr>
-      <w:r>
-        <w:t xml:space="preserve">Zemax </w:t>
-      </w:r>
-      <w:r>
-        <w:rPr>
-          <w:rFonts w:hint="eastAsia"/>
-        </w:rPr>
-        <w:t xml:space="preserve">页用于选择</w:t>
-      </w:r>
-      <w:r>
-        <w:t xml:space="preserve"> </w:t>
-      </w:r>
-      <w:r>
-        <w:rPr>
-          <w:rStyle w:val="VerbatimChar"/>
-        </w:rPr>
-        <w:t xml:space="preserve">.zmx</w:t>
-      </w:r>
-      <w:r>
-        <w:t xml:space="preserve"> </w:t>
-      </w:r>
-      <w:r>
-        <w:rPr>
-          <w:rFonts w:hint="eastAsia"/>
-        </w:rPr>
-        <w:t xml:space="preserve">工程并做非序列相关操作。当前版本不主动打开</w:t>
-      </w:r>
-      <w:r>
-        <w:t xml:space="preserve"> OpticStudio </w:t>
-      </w:r>
-      <w:r>
-        <w:rPr>
-          <w:rFonts w:hint="eastAsia"/>
-        </w:rPr>
-        <w:t xml:space="preserve">GUI，全程后台</w:t>
-      </w:r>
-      <w:r>
-        <w:t xml:space="preserve"> </w:t>
-      </w:r>
-      <w:r>
-        <w:rPr>
-          <w:rFonts w:hint="eastAsia"/>
-        </w:rPr>
-        <w:t xml:space="preserve">ZOS-API，避免「看到的窗口</w:t>
-      </w:r>
-      <w:r>
-        <w:t xml:space="preserve"> ≠ </w:t>
-      </w:r>
-      <w:r>
-        <w:rPr>
-          <w:rFonts w:hint="eastAsia"/>
-        </w:rPr>
-        <w:t xml:space="preserve">后台会话对象」的不一致。</w:t>
-      </w:r>
-    </w:p>
-    <w:p>
-      <w:pPr>
-        <w:pStyle w:val="CaptionedFigure"/>
-      </w:pPr>
-      <w:r>
-        <w:drawing>
-          <wp:inline>
-            <wp:extent cx="5334000" cy="3557367"/>
-            <wp:effectExtent b="0" l="0" r="0" t="0"/>
-            <wp:docPr descr="Zemax 页面" title="" id="25" name="Picture"/>
-            <a:graphic>
-              <a:graphicData uri="http://schemas.openxmlformats.org/drawingml/2006/picture">
-                <pic:pic>
-                  <pic:nvPicPr>
-                    <pic:cNvPr descr="images/zemax_main_mock.png" id="26" name="Picture"/>
-                    <pic:cNvPicPr>
-                      <a:picLocks noChangeArrowheads="1" noChangeAspect="1"/>
-                    </pic:cNvPicPr>
-                  </pic:nvPicPr>
-                  <pic:blipFill>
-                    <a:blip r:embed="rId24"/>
-                    <a:stretch>
-                      <a:fillRect/>
-                    </a:stretch>
-                  </pic:blipFill>
-                  <pic:spPr bwMode="auto">
-                    <a:xfrm>
-                      <a:off x="0" y="0"/>
-                      <a:ext cx="5334000" cy="3557367"/>
-                    </a:xfrm>
-                    <a:prstGeom prst="rect">
-                      <a:avLst/>
-                    </a:prstGeom>
-                    <a:noFill/>
-                    <a:ln w="9525">
-                      <a:noFill/>
-                      <a:headEnd/>
-                      <a:tailEnd/>
-                    </a:ln>
-                  </pic:spPr>
-                </pic:pic>
-              </a:graphicData>
-            </a:graphic>
-          </wp:inline>
-        </w:drawing>
-      </w:r>
-    </w:p>
-    <w:p>
-      <w:pPr>
-        <w:pStyle w:val="ImageCaption"/>
-      </w:pPr>
-      <w:r>
         <w:t xml:space="preserve">Zemax </w:t>
       </w:r>
       <w:r>
@@ -3446,355 +3607,25 @@
     </w:p>
     <w:p>
       <w:pPr>
-        <w:pStyle w:val="BodyText"/>
-      </w:pPr>
-      <w:r>
-        <w:rPr>
-          <w:rFonts w:hint="eastAsia"/>
-        </w:rPr>
-        <w:t xml:space="preserve">光线追迹使用</w:t>
-      </w:r>
-      <w:r>
-        <w:t xml:space="preserve"> Zemax </w:t>
-      </w:r>
-      <w:r>
-        <w:rPr>
-          <w:rFonts w:hint="eastAsia"/>
-        </w:rPr>
-        <w:t xml:space="preserve">工程文件里的默认追迹设置，不在软件界面重复暴露全部参数；执行时先清除非序列探测器已有数据再跑一次</w:t>
-      </w:r>
-      <w:r>
-        <w:t xml:space="preserve"> NSC </w:t>
-      </w:r>
-      <w:r>
-        <w:rPr>
-          <w:rFonts w:hint="eastAsia"/>
-        </w:rPr>
-        <w:t xml:space="preserve">追迹。软件自动检测本机逻辑</w:t>
-      </w:r>
-      <w:r>
-        <w:t xml:space="preserve"> CPU </w:t>
-      </w:r>
-      <w:r>
-        <w:rPr>
-          <w:rFonts w:hint="eastAsia"/>
-        </w:rPr>
-        <w:t xml:space="preserve">核数并默认把</w:t>
-      </w:r>
-      <w:r>
-        <w:t xml:space="preserve"> NSC</w:t>
-      </w:r>
-      <w:r>
-        <w:t xml:space="preserve"> </w:t>
-      </w:r>
-      <w:r>
-        <w:rPr>
-          <w:rStyle w:val="VerbatimChar"/>
-        </w:rPr>
-        <w:t xml:space="preserve">NumberOfCores</w:t>
-      </w:r>
-      <w:r>
-        <w:t xml:space="preserve"> </w:t>
-      </w:r>
-      <w:r>
-        <w:rPr>
-          <w:rFonts w:hint="eastAsia"/>
-        </w:rPr>
-        <w:t xml:space="preserve">设为全部核心，能否真跑满取决于</w:t>
-      </w:r>
-      <w:r>
-        <w:t xml:space="preserve"> </w:t>
-      </w:r>
-      <w:r>
-        <w:rPr>
-          <w:rFonts w:hint="eastAsia"/>
-        </w:rPr>
-        <w:t xml:space="preserve">OpticStudio、工程规模、光线数、探测器类型与许可证；当前不以</w:t>
-      </w:r>
-      <w:r>
-        <w:t xml:space="preserve"> GPU </w:t>
-      </w:r>
-      <w:r>
-        <w:rPr>
-          <w:rFonts w:hint="eastAsia"/>
-        </w:rPr>
-        <w:t xml:space="preserve">追迹为默认流程。</w:t>
-      </w:r>
-    </w:p>
-    <w:p>
-      <w:r>
-        <w:pict>
-          <v:rect style="width:0;height:1.5pt" o:hralign="center" o:hrstd="t" o:hr="t"/>
-        </w:pict>
-      </w:r>
-    </w:p>
-    <w:bookmarkEnd w:id="27"/>
-    <w:bookmarkStart w:id="28" w:name="随机振动多元正态采样"/>
-    <w:p>
-      <w:pPr>
-        <w:pStyle w:val="Heading2"/>
-      </w:pPr>
-      <w:r>
-        <w:t xml:space="preserve">8. </w:t>
-      </w:r>
-      <w:r>
-        <w:rPr>
-          <w:rFonts w:hint="eastAsia"/>
-        </w:rPr>
-        <w:t xml:space="preserve">随机振动：多元正态采样</w:t>
-      </w:r>
-    </w:p>
-    <w:p>
-      <w:pPr>
-        <w:pStyle w:val="FirstParagraph"/>
-      </w:pPr>
-      <w:r>
-        <w:t xml:space="preserve">Mechanical </w:t>
-      </w:r>
-      <w:r>
-        <w:rPr>
-          <w:rFonts w:hint="eastAsia"/>
-        </w:rPr>
-        <w:t xml:space="preserve">随机振动（PSD）分析给出的是各节点的</w:t>
-      </w:r>
-      <w:r>
-        <w:t xml:space="preserve"> 1σ RMS </w:t>
-      </w:r>
-      <w:r>
-        <w:rPr>
-          <w:rFonts w:hint="eastAsia"/>
-        </w:rPr>
-        <w:t xml:space="preserve">响应。软件据此算出每个镜片</w:t>
-      </w:r>
-      <w:r>
-        <w:t xml:space="preserve"> 6 </w:t>
-      </w:r>
-      <w:r>
-        <w:rPr>
-          <w:rFonts w:hint="eastAsia"/>
-        </w:rPr>
-        <w:t xml:space="preserve">个自由度的</w:t>
-      </w:r>
-      <w:r>
-        <w:t xml:space="preserve"> </w:t>
-      </w:r>
-      <w:r>
-        <w:rPr>
-          <w:rFonts w:hint="eastAsia"/>
-        </w:rPr>
-        <w:t xml:space="preserve">1σ，作为标准差，按</w:t>
-      </w:r>
-      <w:r>
-        <w:rPr>
-          <w:rFonts w:hint="eastAsia"/>
-          <w:b/>
-          <w:bCs/>
-        </w:rPr>
-        <w:t xml:space="preserve">多元正态分布</w:t>
-      </w:r>
-      <w:r>
-        <w:rPr>
-          <w:b/>
-          <w:bCs/>
-        </w:rPr>
-        <w:t xml:space="preserve"> N(0, Σ)</w:t>
-      </w:r>
-      <w:r>
-        <w:t xml:space="preserve"> </w:t>
-      </w:r>
-      <w:r>
-        <w:rPr>
-          <w:rFonts w:hint="eastAsia"/>
-        </w:rPr>
-        <w:t xml:space="preserve">生成用户设定数量的随机位移/旋转样本，其中协方差</w:t>
-      </w:r>
-      <w:r>
-        <w:t xml:space="preserve"> </w:t>
-      </w:r>
-      <w:r>
-        <w:rPr>
-          <w:rStyle w:val="VerbatimChar"/>
-        </w:rPr>
-        <w:t xml:space="preserve">Σ = D·C·D</w:t>
-      </w:r>
-      <w:r>
-        <w:rPr>
-          <w:rFonts w:hint="eastAsia"/>
-        </w:rPr>
-        <w:t xml:space="preserve">（D</w:t>
-      </w:r>
-      <w:r>
-        <w:t xml:space="preserve"> </w:t>
-      </w:r>
-      <w:r>
-        <w:rPr>
-          <w:rFonts w:hint="eastAsia"/>
-        </w:rPr>
-        <w:t xml:space="preserve">为各自由度</w:t>
-      </w:r>
-      <w:r>
-        <w:t xml:space="preserve"> 1σ </w:t>
-      </w:r>
-      <w:r>
-        <w:rPr>
-          <w:rFonts w:hint="eastAsia"/>
-        </w:rPr>
-        <w:t xml:space="preserve">的对角阵，C</w:t>
-      </w:r>
-      <w:r>
-        <w:t xml:space="preserve"> </w:t>
-      </w:r>
-      <w:r>
-        <w:rPr>
-          <w:rFonts w:hint="eastAsia"/>
-        </w:rPr>
-        <w:t xml:space="preserve">为相关矩阵）。</w:t>
-      </w:r>
-    </w:p>
-    <w:p>
-      <w:pPr>
-        <w:pStyle w:val="BodyText"/>
-      </w:pPr>
-      <w:r>
-        <w:rPr>
-          <w:rFonts w:hint="eastAsia"/>
-        </w:rPr>
-        <w:t xml:space="preserve">默认</w:t>
-      </w:r>
-      <w:r>
-        <w:t xml:space="preserve"> C </w:t>
-      </w:r>
-      <w:r>
-        <w:rPr>
-          <w:rFonts w:hint="eastAsia"/>
-        </w:rPr>
-        <w:t xml:space="preserve">为单位阵，即各镜片、各自由度独立（与逐项独立高斯采样等价）；若在导出文件夹中放入</w:t>
-      </w:r>
-      <w:r>
-        <w:t xml:space="preserve"> </w:t>
-      </w:r>
-      <w:r>
-        <w:rPr>
-          <w:rStyle w:val="VerbatimChar"/>
-        </w:rPr>
-        <w:t xml:space="preserve">pose_correlation.csv</w:t>
-      </w:r>
-      <w:r>
-        <w:rPr>
-          <w:rFonts w:hint="eastAsia"/>
-        </w:rPr>
-        <w:t xml:space="preserve">（6N×6N</w:t>
-      </w:r>
-      <w:r>
-        <w:t xml:space="preserve"> </w:t>
-      </w:r>
-      <w:r>
-        <w:rPr>
-          <w:rFonts w:hint="eastAsia"/>
-        </w:rPr>
-        <w:t xml:space="preserve">数值矩阵，行列顺序见计算日志），软件会启用该相关矩阵，把镜片间、自由度间的相关性（通常来自模态分析）纳入采样。每个样本仍按「基准</w:t>
-      </w:r>
-      <w:r>
-        <w:t xml:space="preserve"> + </w:t>
-      </w:r>
-      <w:r>
-        <w:rPr>
-          <w:rFonts w:hint="eastAsia"/>
-        </w:rPr>
-        <w:t xml:space="preserve">增量」写入</w:t>
-      </w:r>
-      <w:r>
-        <w:t xml:space="preserve"> Zemax </w:t>
-      </w:r>
-      <w:r>
-        <w:rPr>
-          <w:rFonts w:hint="eastAsia"/>
-        </w:rPr>
-        <w:t xml:space="preserve">并追迹，逐样本结果保存为</w:t>
-      </w:r>
-      <w:r>
-        <w:t xml:space="preserve"> </w:t>
-      </w:r>
-      <w:r>
-        <w:rPr>
-          <w:rStyle w:val="VerbatimChar"/>
-        </w:rPr>
-        <w:t xml:space="preserve">.dts</w:t>
-      </w:r>
-      <w:r>
-        <w:t xml:space="preserve"> </w:t>
-      </w:r>
-      <w:r>
-        <w:rPr>
-          <w:rFonts w:hint="eastAsia"/>
-        </w:rPr>
-        <w:t xml:space="preserve">时间序列，可在探测器窗口顺序播放观察光斑抖动。</w:t>
-      </w:r>
-    </w:p>
-    <w:p>
-      <w:r>
-        <w:pict>
-          <v:rect style="width:0;height:1.5pt" o:hralign="center" o:hrstd="t" o:hr="t"/>
-        </w:pict>
-      </w:r>
-    </w:p>
-    <w:bookmarkEnd w:id="28"/>
-    <w:bookmarkStart w:id="32" w:name="探测器查看与导出"/>
-    <w:p>
-      <w:pPr>
-        <w:pStyle w:val="Heading2"/>
-      </w:pPr>
-      <w:r>
-        <w:t xml:space="preserve">9. </w:t>
-      </w:r>
-      <w:r>
-        <w:rPr>
-          <w:rFonts w:hint="eastAsia"/>
-        </w:rPr>
-        <w:t xml:space="preserve">探测器查看与导出</w:t>
-      </w:r>
-    </w:p>
-    <w:p>
-      <w:pPr>
-        <w:pStyle w:val="FirstParagraph"/>
-      </w:pPr>
-      <w:r>
-        <w:rPr>
-          <w:rFonts w:hint="eastAsia"/>
-        </w:rPr>
-        <w:t xml:space="preserve">在</w:t>
-      </w:r>
-      <w:r>
-        <w:t xml:space="preserve"> Zemax </w:t>
-      </w:r>
-      <w:r>
-        <w:rPr>
-          <w:rFonts w:hint="eastAsia"/>
-        </w:rPr>
-        <w:t xml:space="preserve">页点「打开探测器/时间序列(DTS)窗口」弹出探测器窗口：左侧为探测器列表/当前结果，右侧为光线追迹/结果摘要、时间序列(DTS)播放控制与伪彩色预览。</w:t>
-      </w:r>
-    </w:p>
-    <w:p>
-      <w:pPr>
         <w:pStyle w:val="CaptionedFigure"/>
       </w:pPr>
       <w:r>
         <w:drawing>
           <wp:inline>
-            <wp:extent cx="5334000" cy="3617843"/>
+            <wp:extent cx="5334000" cy="3200399"/>
             <wp:effectExtent b="0" l="0" r="0" t="0"/>
-            <wp:docPr descr="探测器 / 时间序列窗口" title="" id="30" name="Picture"/>
+            <wp:docPr descr="导入后「镜片刚体偏心/倾斜计算结果」表：每镜片 X/Y/Z、Rx/Ry/Rz、面形残差 RMS、来源" title="" id="34" name="Picture"/>
             <a:graphic>
               <a:graphicData uri="http://schemas.openxmlformats.org/drawingml/2006/picture">
                 <pic:pic>
                   <pic:nvPicPr>
-                    <pic:cNvPr descr="images/zemax_detector_mock.png" id="31" name="Picture"/>
+                    <pic:cNvPr descr="images/zemax_pose_results.png" id="35" name="Picture"/>
                     <pic:cNvPicPr>
                       <a:picLocks noChangeArrowheads="1" noChangeAspect="1"/>
                     </pic:cNvPicPr>
                   </pic:nvPicPr>
                   <pic:blipFill>
-                    <a:blip r:embed="rId29"/>
+                    <a:blip r:embed="rId33"/>
                     <a:stretch>
                       <a:fillRect/>
                     </a:stretch>
@@ -3802,7 +3633,7 @@
                   <pic:spPr bwMode="auto">
                     <a:xfrm>
                       <a:off x="0" y="0"/>
-                      <a:ext cx="5334000" cy="3617843"/>
+                      <a:ext cx="5334000" cy="3200399"/>
                     </a:xfrm>
                     <a:prstGeom prst="rect">
                       <a:avLst/>
@@ -3829,6 +3660,488 @@
         <w:rPr>
           <w:rFonts w:hint="eastAsia"/>
         </w:rPr>
+        <w:t xml:space="preserve">导入后「镜片刚体偏心/倾斜计算结果」表：每镜片</w:t>
+      </w:r>
+      <w:r>
+        <w:t xml:space="preserve"> </w:t>
+      </w:r>
+      <w:r>
+        <w:rPr>
+          <w:rFonts w:hint="eastAsia"/>
+        </w:rPr>
+        <w:t xml:space="preserve">X/Y/Z、Rx/Ry/Rz、面形残差</w:t>
+      </w:r>
+      <w:r>
+        <w:t xml:space="preserve"> </w:t>
+      </w:r>
+      <w:r>
+        <w:rPr>
+          <w:rFonts w:hint="eastAsia"/>
+        </w:rPr>
+        <w:t xml:space="preserve">RMS、来源</w:t>
+      </w:r>
+    </w:p>
+    <w:p>
+      <w:pPr>
+        <w:pStyle w:val="BodyText"/>
+      </w:pPr>
+      <w:r>
+        <w:rPr>
+          <w:rFonts w:hint="eastAsia"/>
+        </w:rPr>
+        <w:t xml:space="preserve">光线追迹使用</w:t>
+      </w:r>
+      <w:r>
+        <w:t xml:space="preserve"> Zemax </w:t>
+      </w:r>
+      <w:r>
+        <w:rPr>
+          <w:rFonts w:hint="eastAsia"/>
+        </w:rPr>
+        <w:t xml:space="preserve">工程文件里的默认追迹设置，不在软件界面重复暴露全部参数；执行时先清除非序列探测器已有数据再跑一次</w:t>
+      </w:r>
+      <w:r>
+        <w:t xml:space="preserve"> NSC </w:t>
+      </w:r>
+      <w:r>
+        <w:rPr>
+          <w:rFonts w:hint="eastAsia"/>
+        </w:rPr>
+        <w:t xml:space="preserve">追迹。软件自动检测本机逻辑</w:t>
+      </w:r>
+      <w:r>
+        <w:t xml:space="preserve"> CPU </w:t>
+      </w:r>
+      <w:r>
+        <w:rPr>
+          <w:rFonts w:hint="eastAsia"/>
+        </w:rPr>
+        <w:t xml:space="preserve">核数并默认把</w:t>
+      </w:r>
+      <w:r>
+        <w:t xml:space="preserve"> NSC</w:t>
+      </w:r>
+      <w:r>
+        <w:t xml:space="preserve"> </w:t>
+      </w:r>
+      <w:r>
+        <w:rPr>
+          <w:rStyle w:val="VerbatimChar"/>
+        </w:rPr>
+        <w:t xml:space="preserve">NumberOfCores</w:t>
+      </w:r>
+      <w:r>
+        <w:t xml:space="preserve"> </w:t>
+      </w:r>
+      <w:r>
+        <w:rPr>
+          <w:rFonts w:hint="eastAsia"/>
+        </w:rPr>
+        <w:t xml:space="preserve">设为全部核心，能否真跑满取决于</w:t>
+      </w:r>
+      <w:r>
+        <w:t xml:space="preserve"> </w:t>
+      </w:r>
+      <w:r>
+        <w:rPr>
+          <w:rFonts w:hint="eastAsia"/>
+        </w:rPr>
+        <w:t xml:space="preserve">OpticStudio、工程规模、光线数、探测器类型与许可证；当前不以</w:t>
+      </w:r>
+      <w:r>
+        <w:t xml:space="preserve"> GPU </w:t>
+      </w:r>
+      <w:r>
+        <w:rPr>
+          <w:rFonts w:hint="eastAsia"/>
+        </w:rPr>
+        <w:t xml:space="preserve">追迹为默认流程。</w:t>
+      </w:r>
+    </w:p>
+    <w:p>
+      <w:r>
+        <w:pict>
+          <v:rect style="width:0;height:1.5pt" o:hralign="center" o:hrstd="t" o:hr="t"/>
+        </w:pict>
+      </w:r>
+    </w:p>
+    <w:bookmarkEnd w:id="36"/>
+    <w:bookmarkStart w:id="40" w:name="随机振动多元正态采样"/>
+    <w:p>
+      <w:pPr>
+        <w:pStyle w:val="Heading2"/>
+      </w:pPr>
+      <w:r>
+        <w:t xml:space="preserve">8. </w:t>
+      </w:r>
+      <w:r>
+        <w:rPr>
+          <w:rFonts w:hint="eastAsia"/>
+        </w:rPr>
+        <w:t xml:space="preserve">随机振动：多元正态采样</w:t>
+      </w:r>
+    </w:p>
+    <w:p>
+      <w:pPr>
+        <w:pStyle w:val="FirstParagraph"/>
+      </w:pPr>
+      <w:r>
+        <w:t xml:space="preserve">Mechanical </w:t>
+      </w:r>
+      <w:r>
+        <w:rPr>
+          <w:rFonts w:hint="eastAsia"/>
+        </w:rPr>
+        <w:t xml:space="preserve">随机振动（PSD）分析给出的是各节点的</w:t>
+      </w:r>
+      <w:r>
+        <w:t xml:space="preserve"> 1σ RMS </w:t>
+      </w:r>
+      <w:r>
+        <w:rPr>
+          <w:rFonts w:hint="eastAsia"/>
+        </w:rPr>
+        <w:t xml:space="preserve">响应。软件据此算出每个镜片</w:t>
+      </w:r>
+      <w:r>
+        <w:t xml:space="preserve"> 6 </w:t>
+      </w:r>
+      <w:r>
+        <w:rPr>
+          <w:rFonts w:hint="eastAsia"/>
+        </w:rPr>
+        <w:t xml:space="preserve">个自由度的</w:t>
+      </w:r>
+      <w:r>
+        <w:t xml:space="preserve"> </w:t>
+      </w:r>
+      <w:r>
+        <w:rPr>
+          <w:rFonts w:hint="eastAsia"/>
+        </w:rPr>
+        <w:t xml:space="preserve">1σ，作为标准差，按</w:t>
+      </w:r>
+      <w:r>
+        <w:rPr>
+          <w:rFonts w:hint="eastAsia"/>
+          <w:b/>
+          <w:bCs/>
+        </w:rPr>
+        <w:t xml:space="preserve">多元正态分布</w:t>
+      </w:r>
+      <w:r>
+        <w:rPr>
+          <w:b/>
+          <w:bCs/>
+        </w:rPr>
+        <w:t xml:space="preserve"> N(0, Σ)</w:t>
+      </w:r>
+      <w:r>
+        <w:t xml:space="preserve"> </w:t>
+      </w:r>
+      <w:r>
+        <w:rPr>
+          <w:rFonts w:hint="eastAsia"/>
+        </w:rPr>
+        <w:t xml:space="preserve">生成用户设定数量的随机位移/旋转样本，其中协方差</w:t>
+      </w:r>
+      <w:r>
+        <w:t xml:space="preserve"> </w:t>
+      </w:r>
+      <w:r>
+        <w:rPr>
+          <w:rStyle w:val="VerbatimChar"/>
+        </w:rPr>
+        <w:t xml:space="preserve">Σ = D·C·D</w:t>
+      </w:r>
+      <w:r>
+        <w:rPr>
+          <w:rFonts w:hint="eastAsia"/>
+        </w:rPr>
+        <w:t xml:space="preserve">（D</w:t>
+      </w:r>
+      <w:r>
+        <w:t xml:space="preserve"> </w:t>
+      </w:r>
+      <w:r>
+        <w:rPr>
+          <w:rFonts w:hint="eastAsia"/>
+        </w:rPr>
+        <w:t xml:space="preserve">为各自由度</w:t>
+      </w:r>
+      <w:r>
+        <w:t xml:space="preserve"> 1σ </w:t>
+      </w:r>
+      <w:r>
+        <w:rPr>
+          <w:rFonts w:hint="eastAsia"/>
+        </w:rPr>
+        <w:t xml:space="preserve">的对角阵，C</w:t>
+      </w:r>
+      <w:r>
+        <w:t xml:space="preserve"> </w:t>
+      </w:r>
+      <w:r>
+        <w:rPr>
+          <w:rFonts w:hint="eastAsia"/>
+        </w:rPr>
+        <w:t xml:space="preserve">为相关矩阵）。</w:t>
+      </w:r>
+    </w:p>
+    <w:p>
+      <w:pPr>
+        <w:pStyle w:val="BodyText"/>
+      </w:pPr>
+      <w:r>
+        <w:rPr>
+          <w:rFonts w:hint="eastAsia"/>
+        </w:rPr>
+        <w:t xml:space="preserve">默认</w:t>
+      </w:r>
+      <w:r>
+        <w:t xml:space="preserve"> C </w:t>
+      </w:r>
+      <w:r>
+        <w:rPr>
+          <w:rFonts w:hint="eastAsia"/>
+        </w:rPr>
+        <w:t xml:space="preserve">为单位阵，即各镜片、各自由度独立（与逐项独立高斯采样等价）；若在导出文件夹中放入</w:t>
+      </w:r>
+      <w:r>
+        <w:t xml:space="preserve"> </w:t>
+      </w:r>
+      <w:r>
+        <w:rPr>
+          <w:rStyle w:val="VerbatimChar"/>
+        </w:rPr>
+        <w:t xml:space="preserve">pose_correlation.csv</w:t>
+      </w:r>
+      <w:r>
+        <w:rPr>
+          <w:rFonts w:hint="eastAsia"/>
+        </w:rPr>
+        <w:t xml:space="preserve">（6N×6N</w:t>
+      </w:r>
+      <w:r>
+        <w:t xml:space="preserve"> </w:t>
+      </w:r>
+      <w:r>
+        <w:rPr>
+          <w:rFonts w:hint="eastAsia"/>
+        </w:rPr>
+        <w:t xml:space="preserve">数值矩阵，行列顺序见计算日志），软件会启用该相关矩阵，把镜片间、自由度间的相关性（通常来自模态分析）纳入采样。每个样本仍按「基准</w:t>
+      </w:r>
+      <w:r>
+        <w:t xml:space="preserve"> + </w:t>
+      </w:r>
+      <w:r>
+        <w:rPr>
+          <w:rFonts w:hint="eastAsia"/>
+        </w:rPr>
+        <w:t xml:space="preserve">增量」写入</w:t>
+      </w:r>
+      <w:r>
+        <w:t xml:space="preserve"> Zemax </w:t>
+      </w:r>
+      <w:r>
+        <w:rPr>
+          <w:rFonts w:hint="eastAsia"/>
+        </w:rPr>
+        <w:t xml:space="preserve">并追迹，逐样本结果保存为</w:t>
+      </w:r>
+      <w:r>
+        <w:t xml:space="preserve"> </w:t>
+      </w:r>
+      <w:r>
+        <w:rPr>
+          <w:rStyle w:val="VerbatimChar"/>
+        </w:rPr>
+        <w:t xml:space="preserve">.dts</w:t>
+      </w:r>
+      <w:r>
+        <w:t xml:space="preserve"> </w:t>
+      </w:r>
+      <w:r>
+        <w:rPr>
+          <w:rFonts w:hint="eastAsia"/>
+        </w:rPr>
+        <w:t xml:space="preserve">时间序列，可在探测器窗口顺序播放观察光斑抖动。</w:t>
+      </w:r>
+    </w:p>
+    <w:p>
+      <w:pPr>
+        <w:pStyle w:val="CaptionedFigure"/>
+      </w:pPr>
+      <w:r>
+        <w:drawing>
+          <wp:inline>
+            <wp:extent cx="5334000" cy="3200399"/>
+            <wp:effectExtent b="0" l="0" r="0" t="0"/>
+            <wp:docPr descr="随机振动导入分页：先导入 1σ 结果并匹配镜片，再设「生成数量」按多元正态 N(0, Σ) 采样追迹" title="" id="38" name="Picture"/>
+            <a:graphic>
+              <a:graphicData uri="http://schemas.openxmlformats.org/drawingml/2006/picture">
+                <pic:pic>
+                  <pic:nvPicPr>
+                    <pic:cNvPr descr="images/zemax_random_vibration.png" id="39" name="Picture"/>
+                    <pic:cNvPicPr>
+                      <a:picLocks noChangeArrowheads="1" noChangeAspect="1"/>
+                    </pic:cNvPicPr>
+                  </pic:nvPicPr>
+                  <pic:blipFill>
+                    <a:blip r:embed="rId37"/>
+                    <a:stretch>
+                      <a:fillRect/>
+                    </a:stretch>
+                  </pic:blipFill>
+                  <pic:spPr bwMode="auto">
+                    <a:xfrm>
+                      <a:off x="0" y="0"/>
+                      <a:ext cx="5334000" cy="3200399"/>
+                    </a:xfrm>
+                    <a:prstGeom prst="rect">
+                      <a:avLst/>
+                    </a:prstGeom>
+                    <a:noFill/>
+                    <a:ln w="9525">
+                      <a:noFill/>
+                      <a:headEnd/>
+                      <a:tailEnd/>
+                    </a:ln>
+                  </pic:spPr>
+                </pic:pic>
+              </a:graphicData>
+            </a:graphic>
+          </wp:inline>
+        </w:drawing>
+      </w:r>
+    </w:p>
+    <w:p>
+      <w:pPr>
+        <w:pStyle w:val="ImageCaption"/>
+      </w:pPr>
+      <w:r>
+        <w:rPr>
+          <w:rFonts w:hint="eastAsia"/>
+        </w:rPr>
+        <w:t xml:space="preserve">随机振动导入分页：先导入</w:t>
+      </w:r>
+      <w:r>
+        <w:t xml:space="preserve"> 1σ </w:t>
+      </w:r>
+      <w:r>
+        <w:rPr>
+          <w:rFonts w:hint="eastAsia"/>
+        </w:rPr>
+        <w:t xml:space="preserve">结果并匹配镜片，再设「生成数量」按多元正态</w:t>
+      </w:r>
+      <w:r>
+        <w:t xml:space="preserve"> N(0, Σ) </w:t>
+      </w:r>
+      <w:r>
+        <w:rPr>
+          <w:rFonts w:hint="eastAsia"/>
+        </w:rPr>
+        <w:t xml:space="preserve">采样追迹</w:t>
+      </w:r>
+    </w:p>
+    <w:p>
+      <w:r>
+        <w:pict>
+          <v:rect style="width:0;height:1.5pt" o:hralign="center" o:hrstd="t" o:hr="t"/>
+        </w:pict>
+      </w:r>
+    </w:p>
+    <w:bookmarkEnd w:id="40"/>
+    <w:bookmarkStart w:id="44" w:name="探测器查看与导出"/>
+    <w:p>
+      <w:pPr>
+        <w:pStyle w:val="Heading2"/>
+      </w:pPr>
+      <w:r>
+        <w:t xml:space="preserve">9. </w:t>
+      </w:r>
+      <w:r>
+        <w:rPr>
+          <w:rFonts w:hint="eastAsia"/>
+        </w:rPr>
+        <w:t xml:space="preserve">探测器查看与导出</w:t>
+      </w:r>
+    </w:p>
+    <w:p>
+      <w:pPr>
+        <w:pStyle w:val="FirstParagraph"/>
+      </w:pPr>
+      <w:r>
+        <w:rPr>
+          <w:rFonts w:hint="eastAsia"/>
+        </w:rPr>
+        <w:t xml:space="preserve">在</w:t>
+      </w:r>
+      <w:r>
+        <w:t xml:space="preserve"> Zemax </w:t>
+      </w:r>
+      <w:r>
+        <w:rPr>
+          <w:rFonts w:hint="eastAsia"/>
+        </w:rPr>
+        <w:t xml:space="preserve">页点「打开探测器/时间序列(DTS)窗口」弹出探测器窗口：左侧为探测器列表/当前结果，右侧为光线追迹/结果摘要、时间序列(DTS)播放控制与伪彩色预览。</w:t>
+      </w:r>
+    </w:p>
+    <w:p>
+      <w:pPr>
+        <w:pStyle w:val="CaptionedFigure"/>
+      </w:pPr>
+      <w:r>
+        <w:drawing>
+          <wp:inline>
+            <wp:extent cx="5334000" cy="3254644"/>
+            <wp:effectExtent b="0" l="0" r="0" t="0"/>
+            <wp:docPr descr="探测器 / 时间序列窗口：探测器列表、追迹/结果摘要（含质心）、DTS 播放控件与全分辨率伪彩光斑" title="" id="42" name="Picture"/>
+            <a:graphic>
+              <a:graphicData uri="http://schemas.openxmlformats.org/drawingml/2006/picture">
+                <pic:pic>
+                  <pic:nvPicPr>
+                    <pic:cNvPr descr="images/zemax_detector_window.png" id="43" name="Picture"/>
+                    <pic:cNvPicPr>
+                      <a:picLocks noChangeArrowheads="1" noChangeAspect="1"/>
+                    </pic:cNvPicPr>
+                  </pic:nvPicPr>
+                  <pic:blipFill>
+                    <a:blip r:embed="rId41"/>
+                    <a:stretch>
+                      <a:fillRect/>
+                    </a:stretch>
+                  </pic:blipFill>
+                  <pic:spPr bwMode="auto">
+                    <a:xfrm>
+                      <a:off x="0" y="0"/>
+                      <a:ext cx="5334000" cy="3254644"/>
+                    </a:xfrm>
+                    <a:prstGeom prst="rect">
+                      <a:avLst/>
+                    </a:prstGeom>
+                    <a:noFill/>
+                    <a:ln w="9525">
+                      <a:noFill/>
+                      <a:headEnd/>
+                      <a:tailEnd/>
+                    </a:ln>
+                  </pic:spPr>
+                </pic:pic>
+              </a:graphicData>
+            </a:graphic>
+          </wp:inline>
+        </w:drawing>
+      </w:r>
+    </w:p>
+    <w:p>
+      <w:pPr>
+        <w:pStyle w:val="ImageCaption"/>
+      </w:pPr>
+      <w:r>
+        <w:rPr>
+          <w:rFonts w:hint="eastAsia"/>
+        </w:rPr>
         <w:t xml:space="preserve">探测器</w:t>
       </w:r>
       <w:r>
@@ -3838,7 +4151,16 @@
         <w:rPr>
           <w:rFonts w:hint="eastAsia"/>
         </w:rPr>
-        <w:t xml:space="preserve">时间序列窗口</w:t>
+        <w:t xml:space="preserve">时间序列窗口：探测器列表、追迹/结果摘要（含质心）、DTS</w:t>
+      </w:r>
+      <w:r>
+        <w:t xml:space="preserve"> </w:t>
+      </w:r>
+      <w:r>
+        <w:rPr>
+          <w:rFonts w:hint="eastAsia"/>
+        </w:rPr>
+        <w:t xml:space="preserve">播放控件与全分辨率伪彩光斑</w:t>
       </w:r>
     </w:p>
     <w:p>
@@ -4066,8 +4388,8 @@
         </w:pict>
       </w:r>
     </w:p>
-    <w:bookmarkEnd w:id="32"/>
-    <w:bookmarkStart w:id="33" w:name="命名匹配与基准机制"/>
+    <w:bookmarkEnd w:id="44"/>
+    <w:bookmarkStart w:id="45" w:name="命名匹配与基准机制"/>
     <w:p>
       <w:pPr>
         <w:pStyle w:val="Heading2"/>
@@ -4338,8 +4660,8 @@
         </w:pict>
       </w:r>
     </w:p>
-    <w:bookmarkEnd w:id="33"/>
-    <w:bookmarkStart w:id="34" w:name="文件保存与日志"/>
+    <w:bookmarkEnd w:id="45"/>
+    <w:bookmarkStart w:id="46" w:name="文件保存与日志"/>
     <w:p>
       <w:pPr>
         <w:pStyle w:val="Heading2"/>
@@ -4768,8 +5090,8 @@
         </w:pict>
       </w:r>
     </w:p>
-    <w:bookmarkEnd w:id="34"/>
-    <w:bookmarkStart w:id="35" w:name="注意事项与适用边界"/>
+    <w:bookmarkEnd w:id="46"/>
+    <w:bookmarkStart w:id="47" w:name="注意事项与适用边界"/>
     <w:p>
       <w:pPr>
         <w:pStyle w:val="Heading2"/>
@@ -5318,8 +5640,8 @@
         <w:t xml:space="preserve">源码为准。</w:t>
       </w:r>
     </w:p>
-    <w:bookmarkEnd w:id="35"/>
-    <w:bookmarkEnd w:id="36"/>
+    <w:bookmarkEnd w:id="47"/>
+    <w:bookmarkEnd w:id="48"/>
     <w:sectPr>
       <w:footnotePr>
         <w:numRestart w:val="eachSect"/>

</xml_diff>